<commit_message>
row numbers removed from document template
</commit_message>
<xml_diff>
--- a/elixir_dcp/templates/submission/generate_submission_docx.docx
+++ b/elixir_dcp/templates/submission/generate_submission_docx.docx
@@ -1,6 +1,6 @@
 
 <file path=word/document.xml><?xml version="1.0" encoding="utf-8"?>
-<w:document xmlns:wpc="http://schemas.microsoft.com/office/word/2010/wordprocessingCanvas" xmlns:cx="http://schemas.microsoft.com/office/drawing/2014/chartex" xmlns:cx1="http://schemas.microsoft.com/office/drawing/2015/9/8/chartex" xmlns:mc="http://schemas.openxmlformats.org/markup-compatibility/2006" xmlns:o="urn:schemas-microsoft-com:office:office" xmlns:r="http://schemas.openxmlformats.org/officeDocument/2006/relationships" xmlns:m="http://schemas.openxmlformats.org/officeDocument/2006/math" xmlns:v="urn:schemas-microsoft-com:vml" xmlns:wp14="http://schemas.microsoft.com/office/word/2010/wordprocessingDrawing" xmlns:wp="http://schemas.openxmlformats.org/drawingml/2006/wordprocessingDrawing" xmlns:w10="urn:schemas-microsoft-com:office:word" xmlns:w="http://schemas.openxmlformats.org/wordprocessingml/2006/main" xmlns:w14="http://schemas.microsoft.com/office/word/2010/wordml" xmlns:w15="http://schemas.microsoft.com/office/word/2012/wordml" xmlns:w16se="http://schemas.microsoft.com/office/word/2015/wordml/symex" xmlns:wpg="http://schemas.microsoft.com/office/word/2010/wordprocessingGroup" xmlns:wpi="http://schemas.microsoft.com/office/word/2010/wordprocessingInk" xmlns:wne="http://schemas.microsoft.com/office/word/2006/wordml" xmlns:wps="http://schemas.microsoft.com/office/word/2010/wordprocessingShape" mc:Ignorable="w14 w15 w16se wp14">
+<w:document xmlns:wpc="http://schemas.microsoft.com/office/word/2010/wordprocessingCanvas" xmlns:cx="http://schemas.microsoft.com/office/drawing/2014/chartex" xmlns:cx1="http://schemas.microsoft.com/office/drawing/2015/9/8/chartex" xmlns:cx2="http://schemas.microsoft.com/office/drawing/2015/10/21/chartex" xmlns:cx3="http://schemas.microsoft.com/office/drawing/2016/5/9/chartex" xmlns:cx4="http://schemas.microsoft.com/office/drawing/2016/5/10/chartex" xmlns:cx5="http://schemas.microsoft.com/office/drawing/2016/5/11/chartex" xmlns:cx6="http://schemas.microsoft.com/office/drawing/2016/5/12/chartex" xmlns:cx7="http://schemas.microsoft.com/office/drawing/2016/5/13/chartex" xmlns:cx8="http://schemas.microsoft.com/office/drawing/2016/5/14/chartex" xmlns:mc="http://schemas.openxmlformats.org/markup-compatibility/2006" xmlns:aink="http://schemas.microsoft.com/office/drawing/2016/ink" xmlns:am3d="http://schemas.microsoft.com/office/drawing/2017/model3d" xmlns:o="urn:schemas-microsoft-com:office:office" xmlns:r="http://schemas.openxmlformats.org/officeDocument/2006/relationships" xmlns:m="http://schemas.openxmlformats.org/officeDocument/2006/math" xmlns:v="urn:schemas-microsoft-com:vml" xmlns:wp14="http://schemas.microsoft.com/office/word/2010/wordprocessingDrawing" xmlns:wp="http://schemas.openxmlformats.org/drawingml/2006/wordprocessingDrawing" xmlns:w10="urn:schemas-microsoft-com:office:word" xmlns:w="http://schemas.openxmlformats.org/wordprocessingml/2006/main" xmlns:w14="http://schemas.microsoft.com/office/word/2010/wordml" xmlns:w15="http://schemas.microsoft.com/office/word/2012/wordml" xmlns:w16cex="http://schemas.microsoft.com/office/word/2018/wordml/cex" xmlns:w16cid="http://schemas.microsoft.com/office/word/2016/wordml/cid" xmlns:w16="http://schemas.microsoft.com/office/word/2018/wordml" xmlns:w16se="http://schemas.microsoft.com/office/word/2015/wordml/symex" xmlns:wpg="http://schemas.microsoft.com/office/word/2010/wordprocessingGroup" xmlns:wpi="http://schemas.microsoft.com/office/word/2010/wordprocessingInk" xmlns:wne="http://schemas.microsoft.com/office/word/2006/wordml" xmlns:wps="http://schemas.microsoft.com/office/word/2010/wordprocessingShape" mc:Ignorable="w14 w15 w16se w16cid w16 w16cex wp14">
   <w:body>
     <w:p>
       <w:r>
@@ -30,21 +30,7 @@
         <w:rPr>
           <w:rStyle w:val="NumberingSymbols"/>
         </w:rPr>
-        <w:t xml:space="preserve">{%p if not </w:t>
-      </w:r>
-      <w:proofErr w:type="spellStart"/>
-      <w:r>
-        <w:rPr>
-          <w:rStyle w:val="NumberingSymbols"/>
-        </w:rPr>
-        <w:t>finalised_on</w:t>
-      </w:r>
-      <w:proofErr w:type="spellEnd"/>
-      <w:r>
-        <w:rPr>
-          <w:rStyle w:val="NumberingSymbols"/>
-        </w:rPr>
-        <w:t xml:space="preserve"> %}</w:t>
+        <w:t>{%p if not finalised_on %}</w:t>
       </w:r>
     </w:p>
     <w:p>
@@ -59,66 +45,20 @@
           <w:rStyle w:val="NumberingSymbols"/>
           <w:color w:val="FF0000"/>
         </w:rPr>
-        <w:t>! Warning: The submission {</w:t>
-      </w:r>
-      <w:proofErr w:type="gramStart"/>
-      <w:r>
+        <w:t>! Warning: The submission {{ ref_name }} is not finalized – some information may be missing or under review !</w:t>
+      </w:r>
+    </w:p>
+    <w:p>
+      <w:pPr>
         <w:rPr>
           <w:rStyle w:val="NumberingSymbols"/>
-          <w:color w:val="FF0000"/>
-        </w:rPr>
-        <w:t xml:space="preserve">{ </w:t>
-      </w:r>
-      <w:proofErr w:type="spellStart"/>
+        </w:rPr>
+      </w:pPr>
       <w:r>
         <w:rPr>
           <w:rStyle w:val="NumberingSymbols"/>
-          <w:color w:val="FF0000"/>
-        </w:rPr>
-        <w:t>ref</w:t>
-      </w:r>
-      <w:proofErr w:type="gramEnd"/>
-      <w:r>
-        <w:rPr>
-          <w:rStyle w:val="NumberingSymbols"/>
-          <w:color w:val="FF0000"/>
-        </w:rPr>
-        <w:t>_name</w:t>
-      </w:r>
-      <w:proofErr w:type="spellEnd"/>
-      <w:r>
-        <w:rPr>
-          <w:rStyle w:val="NumberingSymbols"/>
-          <w:color w:val="FF0000"/>
-        </w:rPr>
-        <w:t xml:space="preserve"> }} is not finalized – some information may be missing or under review !</w:t>
-      </w:r>
-    </w:p>
-    <w:p>
-      <w:pPr>
-        <w:rPr>
-          <w:rStyle w:val="NumberingSymbols"/>
-        </w:rPr>
-      </w:pPr>
-      <w:r>
-        <w:rPr>
-          <w:rStyle w:val="NumberingSymbols"/>
-        </w:rPr>
-        <w:t xml:space="preserve">{%p </w:t>
-      </w:r>
-      <w:proofErr w:type="spellStart"/>
-      <w:r>
-        <w:rPr>
-          <w:rStyle w:val="NumberingSymbols"/>
-        </w:rPr>
-        <w:t>endif</w:t>
-      </w:r>
-      <w:proofErr w:type="spellEnd"/>
-      <w:r>
-        <w:rPr>
-          <w:rStyle w:val="NumberingSymbols"/>
-        </w:rPr>
-        <w:t xml:space="preserve"> %}</w:t>
+        </w:rPr>
+        <w:t>{%p endif %}</w:t>
       </w:r>
     </w:p>
     <w:p>
@@ -139,13 +79,7 @@
         <w:rPr>
           <w:rStyle w:val="NumberingSymbols"/>
         </w:rPr>
-        <w:t xml:space="preserve">g </w:t>
-      </w:r>
-      <w:r>
-        <w:rPr>
-          <w:rStyle w:val="NumberingSymbols"/>
-        </w:rPr>
-        <w:t>of personal data, UL/LCSB needs to record information on data subjects, cohort details and contacts for any Personal Data submitted to the Luxembourg ELIXIR platform. This is the purpose of this annex.</w:t>
+        <w:t>g of personal data, UL/LCSB needs to record information on data subjects, cohort details and contacts for any Personal Data submitted to the Luxembourg ELIXIR platform. This is the purpose of this annex.</w:t>
       </w:r>
     </w:p>
     <w:p>
@@ -169,67 +103,12 @@
           <w:sz w:val="24"/>
           <w:szCs w:val="24"/>
         </w:rPr>
-        <w:t>{</w:t>
-      </w:r>
-      <w:proofErr w:type="gramStart"/>
-      <w:r>
-        <w:rPr>
-          <w:rFonts w:ascii="Arial" w:hAnsi="Arial"/>
-          <w:sz w:val="24"/>
-          <w:szCs w:val="24"/>
-        </w:rPr>
-        <w:t xml:space="preserve">{ </w:t>
-      </w:r>
-      <w:proofErr w:type="spellStart"/>
-      <w:r>
-        <w:rPr>
-          <w:rFonts w:ascii="Arial" w:hAnsi="Arial"/>
-          <w:sz w:val="24"/>
-          <w:szCs w:val="24"/>
-        </w:rPr>
-        <w:t>submitting</w:t>
-      </w:r>
-      <w:proofErr w:type="gramEnd"/>
-      <w:r>
-        <w:rPr>
-          <w:rFonts w:ascii="Arial" w:hAnsi="Arial"/>
-          <w:sz w:val="24"/>
-          <w:szCs w:val="24"/>
-        </w:rPr>
-        <w:t>_institution_name</w:t>
-      </w:r>
-      <w:proofErr w:type="spellEnd"/>
-      <w:r>
-        <w:rPr>
-          <w:rFonts w:ascii="Arial" w:hAnsi="Arial"/>
-          <w:sz w:val="24"/>
-          <w:szCs w:val="24"/>
-        </w:rPr>
-        <w:t xml:space="preserve"> }}</w:t>
-      </w:r>
-    </w:p>
-    <w:p>
-      <w:r>
-        <w:t>{</w:t>
-      </w:r>
-      <w:proofErr w:type="gramStart"/>
-      <w:r>
-        <w:t xml:space="preserve">{ </w:t>
-      </w:r>
-      <w:proofErr w:type="spellStart"/>
-      <w:r>
-        <w:t>submitting</w:t>
-      </w:r>
-      <w:proofErr w:type="gramEnd"/>
-      <w:r>
-        <w:t>_insti</w:t>
-      </w:r>
-      <w:r>
-        <w:t>tution_name</w:t>
-      </w:r>
-      <w:proofErr w:type="spellEnd"/>
-      <w:r>
-        <w:t xml:space="preserve"> }} (hereinafter “</w:t>
+        <w:t>{{ submitting_institution_name }}</w:t>
+      </w:r>
+    </w:p>
+    <w:p>
+      <w:r>
+        <w:t>{{ submitting_institution_name }} (hereinafter “</w:t>
       </w:r>
       <w:r>
         <w:rPr>
@@ -238,66 +117,7 @@
         <w:t>Data Provider</w:t>
       </w:r>
       <w:r>
-        <w:t>”), with its offices established at {{</w:t>
-      </w:r>
-      <w:proofErr w:type="spellStart"/>
-      <w:r>
-        <w:t>submitting_institution_address</w:t>
-      </w:r>
-      <w:proofErr w:type="spellEnd"/>
-      <w:r>
-        <w:t>}}, legally represented by {{ (</w:t>
-      </w:r>
-      <w:proofErr w:type="spellStart"/>
-      <w:r>
-        <w:t>data_providers</w:t>
-      </w:r>
-      <w:proofErr w:type="spellEnd"/>
-      <w:r>
-        <w:t xml:space="preserve"> | first)[‘</w:t>
-      </w:r>
-      <w:proofErr w:type="spellStart"/>
-      <w:r>
-        <w:t>first_name</w:t>
-      </w:r>
-      <w:proofErr w:type="spellEnd"/>
-      <w:r>
-        <w:t>’] }} {{ (</w:t>
-      </w:r>
-      <w:proofErr w:type="spellStart"/>
-      <w:r>
-        <w:t>data_providers</w:t>
-      </w:r>
-      <w:proofErr w:type="spellEnd"/>
-      <w:r>
-        <w:t xml:space="preserve"> | first)[‘</w:t>
-      </w:r>
-      <w:proofErr w:type="spellStart"/>
-      <w:r>
-        <w:t>last_name</w:t>
-      </w:r>
-      <w:proofErr w:type="spellEnd"/>
-      <w:r>
-        <w:t>’] | upper }}, transfers the data to</w:t>
-      </w:r>
-      <w:r>
-        <w:t xml:space="preserve"> {{ </w:t>
-      </w:r>
-      <w:proofErr w:type="spellStart"/>
-      <w:r>
-        <w:t>local_custodians</w:t>
-      </w:r>
-      <w:proofErr w:type="spellEnd"/>
-      <w:r>
-        <w:t xml:space="preserve"> | join(‘ and ’) }} at {{ </w:t>
-      </w:r>
-      <w:proofErr w:type="spellStart"/>
-      <w:r>
-        <w:t>submission_scope_label</w:t>
-      </w:r>
-      <w:proofErr w:type="spellEnd"/>
-      <w:r>
-        <w:t xml:space="preserve"> }}.</w:t>
+        <w:t>”), with its offices established at {{submitting_institution_address}}, legally represented by {{ (data_providers | first)[‘first_name’] }} {{ (data_providers | first)[‘last_name’] | upper }}, transfers the data to {{ local_custodians | join(‘ and ’) }} at {{ submission_scope_label }}.</w:t>
       </w:r>
     </w:p>
     <w:p>
@@ -308,21 +128,7 @@
         <w:rPr>
           <w:b/>
         </w:rPr>
-        <w:t>“{</w:t>
-      </w:r>
-      <w:proofErr w:type="gramStart"/>
-      <w:r>
-        <w:rPr>
-          <w:b/>
-        </w:rPr>
-        <w:t>{ title</w:t>
-      </w:r>
-      <w:proofErr w:type="gramEnd"/>
-      <w:r>
-        <w:rPr>
-          <w:b/>
-        </w:rPr>
-        <w:t xml:space="preserve"> }}”</w:t>
+        <w:t>“{{ title }}”</w:t>
       </w:r>
       <w:r>
         <w:t xml:space="preserve"> in the context of the project </w:t>
@@ -338,23 +144,7 @@
           <w:b/>
           <w:bCs/>
         </w:rPr>
-        <w:t xml:space="preserve">{{ </w:t>
-      </w:r>
-      <w:proofErr w:type="spellStart"/>
-      <w:r>
-        <w:rPr>
-          <w:b/>
-          <w:bCs/>
-        </w:rPr>
-        <w:t>local_project</w:t>
-      </w:r>
-      <w:proofErr w:type="spellEnd"/>
-      <w:r>
-        <w:rPr>
-          <w:b/>
-          <w:bCs/>
-        </w:rPr>
-        <w:t xml:space="preserve"> }}”</w:t>
+        <w:t>{{ local_project }}”</w:t>
       </w:r>
       <w:r>
         <w:t>.</w:t>
@@ -369,23 +159,12 @@
     </w:p>
     <w:p>
       <w:r>
-        <w:t>The Data Provider appoints the following contacts for this submissi</w:t>
-      </w:r>
-      <w:r>
-        <w:t>on:</w:t>
-      </w:r>
-    </w:p>
-    <w:p>
-      <w:r>
-        <w:t xml:space="preserve">{%p for provider in </w:t>
-      </w:r>
-      <w:proofErr w:type="spellStart"/>
-      <w:r>
-        <w:t>data_providers</w:t>
-      </w:r>
-      <w:proofErr w:type="spellEnd"/>
-      <w:r>
-        <w:t xml:space="preserve"> %}</w:t>
+        <w:t>The Data Provider appoints the following contacts for this submission:</w:t>
+      </w:r>
+    </w:p>
+    <w:p>
+      <w:r>
+        <w:t>{%p for provider in data_providers %}</w:t>
       </w:r>
     </w:p>
     <w:p>
@@ -399,21 +178,12 @@
       <w:r>
         <w:t xml:space="preserve">{%r if </w:t>
       </w:r>
-      <w:proofErr w:type="spellStart"/>
       <w:r>
         <w:rPr>
           <w:rStyle w:val="Quotation"/>
           <w:rFonts w:cstheme="minorHAnsi"/>
         </w:rPr>
-        <w:t>loop.first</w:t>
-      </w:r>
-      <w:proofErr w:type="spellEnd"/>
-      <w:r>
-        <w:rPr>
-          <w:rStyle w:val="Quotation"/>
-          <w:rFonts w:cstheme="minorHAnsi"/>
-        </w:rPr>
-        <w:t xml:space="preserve"> %}</w:t>
+        <w:t>loop.first %}</w:t>
       </w:r>
       <w:r>
         <w:rPr>
@@ -431,109 +201,26 @@
           <w:rStyle w:val="Quotation"/>
           <w:rFonts w:cstheme="minorHAnsi"/>
         </w:rPr>
-        <w:t xml:space="preserve"> {%r else %}Additional contact: {%r </w:t>
-      </w:r>
-      <w:proofErr w:type="spellStart"/>
-      <w:r>
-        <w:rPr>
-          <w:rStyle w:val="Quotation"/>
-          <w:rFonts w:cstheme="minorHAnsi"/>
-        </w:rPr>
-        <w:t>endif</w:t>
-      </w:r>
-      <w:proofErr w:type="spellEnd"/>
-      <w:r>
-        <w:rPr>
-          <w:rStyle w:val="Quotation"/>
-          <w:rFonts w:cstheme="minorHAnsi"/>
-        </w:rPr>
-        <w:t xml:space="preserve"> %}</w:t>
-      </w:r>
-      <w:r>
-        <w:t xml:space="preserve"> {{</w:t>
-      </w:r>
-      <w:proofErr w:type="spellStart"/>
-      <w:r>
-        <w:t>provider.first_name</w:t>
-      </w:r>
-      <w:proofErr w:type="spellEnd"/>
-      <w:r>
-        <w:t>}} {{</w:t>
-      </w:r>
-      <w:proofErr w:type="spellStart"/>
-      <w:r>
-        <w:t>provider.last_name</w:t>
-      </w:r>
-      <w:proofErr w:type="spellEnd"/>
-      <w:r>
-        <w:t xml:space="preserve"> | upper}}; role: {{</w:t>
-      </w:r>
-      <w:proofErr w:type="spellStart"/>
-      <w:r>
-        <w:t>provider.role</w:t>
-      </w:r>
-      <w:proofErr w:type="spellEnd"/>
-      <w:r>
-        <w:t xml:space="preserve"> | replace(‘_’, ‘ ‘)}}; e-mail: {{</w:t>
-      </w:r>
-      <w:proofErr w:type="spellStart"/>
-      <w:r>
-        <w:t>provider.email</w:t>
-      </w:r>
-      <w:proofErr w:type="spellEnd"/>
-      <w:r>
-        <w:t>}}</w:t>
-      </w:r>
-    </w:p>
-    <w:p>
-      <w:r>
-        <w:t xml:space="preserve">{%p </w:t>
-      </w:r>
-      <w:proofErr w:type="spellStart"/>
-      <w:r>
-        <w:t>endf</w:t>
-      </w:r>
-      <w:r>
-        <w:t>or</w:t>
-      </w:r>
-      <w:proofErr w:type="spellEnd"/>
-      <w:r>
-        <w:t xml:space="preserve"> %}</w:t>
+        <w:t xml:space="preserve"> {%r else %}Additional contact: {%r endif %}</w:t>
+      </w:r>
+      <w:r>
+        <w:t xml:space="preserve"> {{provider.first_name}} {{provider.last_name | upper}}; role: {{provider.role | replace(‘_’, ‘ ‘)}}; e-mail: {{provider.email}}</w:t>
+      </w:r>
+    </w:p>
+    <w:p>
+      <w:r>
+        <w:t>{%p endfor %}</w:t>
       </w:r>
     </w:p>
     <w:p/>
     <w:p>
       <w:r>
-        <w:t xml:space="preserve">The submission contains {{ studies | length }} study sheet{{ studies | pluralize }} and {{ </w:t>
-      </w:r>
-      <w:proofErr w:type="spellStart"/>
-      <w:r>
-        <w:t>datadecs</w:t>
-      </w:r>
-      <w:proofErr w:type="spellEnd"/>
-      <w:r>
-        <w:t xml:space="preserve"> | length }} data sheet{{ </w:t>
-      </w:r>
-      <w:proofErr w:type="spellStart"/>
-      <w:r>
-        <w:t>datadecs</w:t>
-      </w:r>
-      <w:proofErr w:type="spellEnd"/>
-      <w:r>
-        <w:t xml:space="preserve"> | pluralize }}{% if attachments | length == 0 %}.{% else %} as well as the following additional documents:</w:t>
-      </w:r>
-    </w:p>
-    <w:p>
-      <w:r>
-        <w:t xml:space="preserve">{%p for </w:t>
-      </w:r>
-      <w:proofErr w:type="spellStart"/>
-      <w:r>
-        <w:t>attachement</w:t>
-      </w:r>
-      <w:proofErr w:type="spellEnd"/>
-      <w:r>
-        <w:t xml:space="preserve"> in attachments %}</w:t>
+        <w:t>The submission contains {{ studies | length }} study sheet{{ studies | pluralize }} and {{ datadecs | length }} data sheet{{ datadecs | pluralize }}{% if attachments | length == 0 %}.{% else %} as well as the following additional documents:</w:t>
+      </w:r>
+    </w:p>
+    <w:p>
+      <w:r>
+        <w:t>{%p for attachement in attachments %}</w:t>
       </w:r>
     </w:p>
     <w:p>
@@ -545,16 +232,11 @@
         </w:numPr>
       </w:pPr>
       <w:r>
-        <w:t xml:space="preserve">{{ </w:t>
-      </w:r>
-      <w:proofErr w:type="spellStart"/>
-      <w:r>
-        <w:t>attachement.</w:t>
+        <w:t>{{ attachement.</w:t>
       </w:r>
       <w:r>
         <w:t>files</w:t>
       </w:r>
-      <w:proofErr w:type="spellEnd"/>
       <w:r>
         <w:t>[0][‘$ref’]</w:t>
       </w:r>
@@ -562,41 +244,17 @@
         <w:t xml:space="preserve"> }}</w:t>
       </w:r>
       <w:r>
-        <w:t xml:space="preserve"> – {{ </w:t>
-      </w:r>
-      <w:proofErr w:type="spellStart"/>
-      <w:r>
-        <w:t>attachement.description</w:t>
-      </w:r>
-      <w:proofErr w:type="spellEnd"/>
-      <w:r>
-        <w:t xml:space="preserve"> }}</w:t>
-      </w:r>
-    </w:p>
-    <w:p>
-      <w:r>
-        <w:t xml:space="preserve">{%p </w:t>
-      </w:r>
-      <w:proofErr w:type="spellStart"/>
-      <w:r>
-        <w:t>endfor</w:t>
-      </w:r>
-      <w:proofErr w:type="spellEnd"/>
-      <w:r>
-        <w:t xml:space="preserve"> %}</w:t>
-      </w:r>
-    </w:p>
-    <w:p>
-      <w:r>
-        <w:t xml:space="preserve">{% </w:t>
-      </w:r>
-      <w:proofErr w:type="spellStart"/>
-      <w:r>
-        <w:t>endif</w:t>
-      </w:r>
-      <w:proofErr w:type="spellEnd"/>
-      <w:r>
-        <w:t xml:space="preserve"> %}</w:t>
+        <w:t xml:space="preserve"> – {{ attachement.description }}</w:t>
+      </w:r>
+    </w:p>
+    <w:p>
+      <w:r>
+        <w:t>{%p endfor %}</w:t>
+      </w:r>
+    </w:p>
+    <w:p>
+      <w:r>
+        <w:t>{% endif %}</w:t>
       </w:r>
     </w:p>
     <w:p>
@@ -606,23 +264,7 @@
     </w:p>
     <w:p>
       <w:r>
-        <w:t xml:space="preserve">{% set </w:t>
-      </w:r>
-      <w:proofErr w:type="spellStart"/>
-      <w:r>
-        <w:t>study_index</w:t>
-      </w:r>
-      <w:proofErr w:type="spellEnd"/>
-      <w:r>
-        <w:t xml:space="preserve"> = </w:t>
-      </w:r>
-      <w:proofErr w:type="spellStart"/>
-      <w:r>
-        <w:t>loop.index</w:t>
-      </w:r>
-      <w:proofErr w:type="spellEnd"/>
-      <w:r>
-        <w:t xml:space="preserve"> %}</w:t>
+        <w:t>{% set study_index = loop.index %}</w:t>
       </w:r>
     </w:p>
     <w:p>
@@ -644,155 +286,41 @@
         <w:pStyle w:val="Heading3"/>
       </w:pPr>
       <w:r>
-        <w:t>Study {</w:t>
-      </w:r>
-      <w:proofErr w:type="gramStart"/>
-      <w:r>
-        <w:t xml:space="preserve">{ </w:t>
-      </w:r>
-      <w:proofErr w:type="spellStart"/>
-      <w:r>
-        <w:t>study</w:t>
-      </w:r>
-      <w:proofErr w:type="gramEnd"/>
-      <w:r>
-        <w:t>_index</w:t>
-      </w:r>
-      <w:proofErr w:type="spellEnd"/>
-      <w:r>
-        <w:t xml:space="preserve">}}: {{ </w:t>
-      </w:r>
-      <w:proofErr w:type="spellStart"/>
-      <w:r>
-        <w:t>study.title</w:t>
-      </w:r>
-      <w:proofErr w:type="spellEnd"/>
-      <w:r>
-        <w:t xml:space="preserve"> }}</w:t>
-      </w:r>
-    </w:p>
-    <w:p>
-      <w:r>
-        <w:t>Description: {</w:t>
-      </w:r>
-      <w:proofErr w:type="gramStart"/>
-      <w:r>
-        <w:t xml:space="preserve">{ </w:t>
-      </w:r>
-      <w:proofErr w:type="spellStart"/>
-      <w:r>
-        <w:t>study.description</w:t>
-      </w:r>
-      <w:proofErr w:type="spellEnd"/>
-      <w:proofErr w:type="gramEnd"/>
-      <w:r>
-        <w:t xml:space="preserve"> }}</w:t>
-      </w:r>
-    </w:p>
-    <w:p>
-      <w:r>
-        <w:t xml:space="preserve">{% if </w:t>
-      </w:r>
-      <w:proofErr w:type="spellStart"/>
-      <w:r>
-        <w:t>study.website</w:t>
-      </w:r>
-      <w:proofErr w:type="spellEnd"/>
-      <w:r>
-        <w:t xml:space="preserve"> %} </w:t>
-      </w:r>
-      <w:r>
-        <w:t>Website: {</w:t>
-      </w:r>
-      <w:proofErr w:type="gramStart"/>
-      <w:r>
-        <w:t xml:space="preserve">{ </w:t>
-      </w:r>
-      <w:proofErr w:type="spellStart"/>
-      <w:r>
-        <w:t>study.website</w:t>
-      </w:r>
-      <w:proofErr w:type="spellEnd"/>
-      <w:proofErr w:type="gramEnd"/>
-      <w:r>
-        <w:t xml:space="preserve"> }}</w:t>
-      </w:r>
-      <w:r>
-        <w:t xml:space="preserve"> {% </w:t>
-      </w:r>
-      <w:proofErr w:type="spellStart"/>
-      <w:r>
-        <w:t>endif</w:t>
-      </w:r>
-      <w:proofErr w:type="spellEnd"/>
-      <w:r>
-        <w:t xml:space="preserve"> %}</w:t>
-      </w:r>
-    </w:p>
-    <w:p>
-      <w:r>
-        <w:t xml:space="preserve">{% if </w:t>
-      </w:r>
-      <w:proofErr w:type="spellStart"/>
-      <w:r>
-        <w:t>study.remarks</w:t>
-      </w:r>
-      <w:proofErr w:type="spellEnd"/>
-      <w:r>
-        <w:t xml:space="preserve"> %} </w:t>
-      </w:r>
-      <w:r>
-        <w:t>Remarks: {</w:t>
-      </w:r>
-      <w:proofErr w:type="gramStart"/>
-      <w:r>
-        <w:t xml:space="preserve">{ </w:t>
-      </w:r>
-      <w:proofErr w:type="spellStart"/>
-      <w:r>
-        <w:t>study.remarks</w:t>
-      </w:r>
-      <w:proofErr w:type="spellEnd"/>
-      <w:proofErr w:type="gramEnd"/>
-      <w:r>
-        <w:t xml:space="preserve"> }}</w:t>
-      </w:r>
-      <w:r>
-        <w:t xml:space="preserve"> {% </w:t>
-      </w:r>
-      <w:proofErr w:type="spellStart"/>
-      <w:r>
-        <w:t>endif</w:t>
-      </w:r>
-      <w:proofErr w:type="spellEnd"/>
-      <w:r>
-        <w:t xml:space="preserve"> %}</w:t>
+        <w:t>Study {{ study_index}}: {{ study.title }}</w:t>
+      </w:r>
+    </w:p>
+    <w:p>
+      <w:r>
+        <w:t>Description: {{ study.description }}</w:t>
+      </w:r>
+    </w:p>
+    <w:p>
+      <w:r>
+        <w:t xml:space="preserve">{% if study.website %} </w:t>
+      </w:r>
+      <w:r>
+        <w:t>Website: {{ study.website }}</w:t>
+      </w:r>
+      <w:r>
+        <w:t xml:space="preserve"> {% endif %}</w:t>
+      </w:r>
+    </w:p>
+    <w:p>
+      <w:r>
+        <w:t xml:space="preserve">{% if study.remarks %} </w:t>
+      </w:r>
+      <w:r>
+        <w:t>Remarks: {{ study.remarks }}</w:t>
+      </w:r>
+      <w:r>
+        <w:t xml:space="preserve"> {% endif %}</w:t>
       </w:r>
     </w:p>
     <w:p/>
     <w:p>
       <w:r>
         <w:lastRenderedPageBreak/>
-        <w:t>As for the study, the Data Provider hereby confirms that an ethics approval exists for the data collection as well as the data sharing for the purposes as foreseen in the Hosting and Processing Agreement under</w:t>
-      </w:r>
-      <w:r>
-        <w:t xml:space="preserve"> the ethics approval identifier {</w:t>
-      </w:r>
-      <w:proofErr w:type="gramStart"/>
-      <w:r>
-        <w:t xml:space="preserve">{ </w:t>
-      </w:r>
-      <w:proofErr w:type="spellStart"/>
-      <w:r>
-        <w:t>study.ethics</w:t>
-      </w:r>
-      <w:proofErr w:type="gramEnd"/>
-      <w:r>
-        <w:t>_approval_no</w:t>
-      </w:r>
-      <w:proofErr w:type="spellEnd"/>
-      <w:r>
-        <w:t xml:space="preserve"> }}.</w:t>
+        <w:t>As for the study, the Data Provider hereby confirms that an ethics approval exists for the data collection as well as the data sharing for the purposes as foreseen in the Hosting and Processing Agreement under the ethics approval identifier {{ study.ethics_approval_no }}.</w:t>
       </w:r>
     </w:p>
     <w:p>
@@ -804,49 +332,17 @@
     </w:p>
     <w:p>
       <w:r>
-        <w:t xml:space="preserve">{%p if </w:t>
-      </w:r>
-      <w:proofErr w:type="spellStart"/>
-      <w:r>
-        <w:t>study.study_types</w:t>
-      </w:r>
-      <w:proofErr w:type="spellEnd"/>
-      <w:r>
-        <w:t xml:space="preserve"> %}</w:t>
-      </w:r>
-    </w:p>
-    <w:p>
-      <w:r>
-        <w:t>As for Study 1, the characteristics are specified as follows: {</w:t>
-      </w:r>
-      <w:proofErr w:type="gramStart"/>
-      <w:r>
-        <w:t xml:space="preserve">{ </w:t>
-      </w:r>
-      <w:proofErr w:type="spellStart"/>
-      <w:r>
-        <w:t>study.study</w:t>
-      </w:r>
-      <w:proofErr w:type="gramEnd"/>
-      <w:r>
-        <w:t>_types</w:t>
-      </w:r>
-      <w:proofErr w:type="spellEnd"/>
-      <w:r>
-        <w:t xml:space="preserve"> | join(‘, ‘) }}</w:t>
-      </w:r>
-    </w:p>
-    <w:p>
-      <w:r>
-        <w:t xml:space="preserve">{%p </w:t>
-      </w:r>
-      <w:proofErr w:type="spellStart"/>
-      <w:r>
-        <w:t>endif</w:t>
-      </w:r>
-      <w:proofErr w:type="spellEnd"/>
-      <w:r>
-        <w:t xml:space="preserve"> %}</w:t>
+        <w:t>{%p if study.study_types %}</w:t>
+      </w:r>
+    </w:p>
+    <w:p>
+      <w:r>
+        <w:t>As for Study 1, the characteristics are specified as follows: {{ study.study_types | join(‘, ‘) }}</w:t>
+      </w:r>
+    </w:p>
+    <w:p>
+      <w:r>
+        <w:t>{%p endif %}</w:t>
       </w:r>
     </w:p>
     <w:p>
@@ -934,23 +430,7 @@
           </w:tcPr>
           <w:p>
             <w:r>
-              <w:t>{%</w:t>
-            </w:r>
-            <w:proofErr w:type="spellStart"/>
-            <w:r>
-              <w:t>tr</w:t>
-            </w:r>
-            <w:proofErr w:type="spellEnd"/>
-            <w:r>
-              <w:t xml:space="preserve"> for contact in </w:t>
-            </w:r>
-            <w:proofErr w:type="spellStart"/>
-            <w:r>
-              <w:t>study.contacts</w:t>
-            </w:r>
-            <w:proofErr w:type="spellEnd"/>
-            <w:r>
-              <w:t xml:space="preserve"> %}</w:t>
+              <w:t>{%tr for contact in study.contacts %}</w:t>
             </w:r>
           </w:p>
         </w:tc>
@@ -965,21 +445,12 @@
             <w:r>
               <w:t xml:space="preserve">{% if </w:t>
             </w:r>
-            <w:proofErr w:type="spellStart"/>
             <w:r>
               <w:rPr>
                 <w:rStyle w:val="Quotation"/>
                 <w:rFonts w:cstheme="minorHAnsi"/>
               </w:rPr>
-              <w:t>loop.first</w:t>
-            </w:r>
-            <w:proofErr w:type="spellEnd"/>
-            <w:r>
-              <w:rPr>
-                <w:rStyle w:val="Quotation"/>
-                <w:rFonts w:cstheme="minorHAnsi"/>
-              </w:rPr>
-              <w:t xml:space="preserve"> %}</w:t>
+              <w:t>loop.first %}</w:t>
             </w:r>
             <w:r>
               <w:rPr>
@@ -997,23 +468,7 @@
                 <w:rStyle w:val="Quotation"/>
                 <w:rFonts w:cstheme="minorHAnsi"/>
               </w:rPr>
-              <w:t xml:space="preserve"> {% else %} Additional contact: {% </w:t>
-            </w:r>
-            <w:proofErr w:type="spellStart"/>
-            <w:r>
-              <w:rPr>
-                <w:rStyle w:val="Quotation"/>
-                <w:rFonts w:cstheme="minorHAnsi"/>
-              </w:rPr>
-              <w:t>endif</w:t>
-            </w:r>
-            <w:proofErr w:type="spellEnd"/>
-            <w:r>
-              <w:rPr>
-                <w:rStyle w:val="Quotation"/>
-                <w:rFonts w:cstheme="minorHAnsi"/>
-              </w:rPr>
-              <w:t xml:space="preserve"> %}</w:t>
+              <w:t xml:space="preserve"> {% else %} Additional contact: {% endif %}</w:t>
             </w:r>
           </w:p>
         </w:tc>
@@ -1024,23 +479,7 @@
           </w:tcPr>
           <w:p>
             <w:r>
-              <w:t xml:space="preserve">{{ </w:t>
-            </w:r>
-            <w:proofErr w:type="spellStart"/>
-            <w:r>
-              <w:t>contact.first_name</w:t>
-            </w:r>
-            <w:proofErr w:type="spellEnd"/>
-            <w:r>
-              <w:t xml:space="preserve"> }} {{ </w:t>
-            </w:r>
-            <w:proofErr w:type="spellStart"/>
-            <w:r>
-              <w:t>contact.last_name</w:t>
-            </w:r>
-            <w:proofErr w:type="spellEnd"/>
-            <w:r>
-              <w:t xml:space="preserve"> }}</w:t>
+              <w:t>{{ contact.first_name }} {{ contact.last_name }}</w:t>
             </w:r>
           </w:p>
         </w:tc>
@@ -1051,15 +490,7 @@
           </w:tcPr>
           <w:p>
             <w:r>
-              <w:t xml:space="preserve">{{ </w:t>
-            </w:r>
-            <w:proofErr w:type="spellStart"/>
-            <w:r>
-              <w:t>contact.institution</w:t>
-            </w:r>
-            <w:proofErr w:type="spellEnd"/>
-            <w:r>
-              <w:t>}}</w:t>
+              <w:t>{{ contact.institution}}</w:t>
             </w:r>
           </w:p>
         </w:tc>
@@ -1074,15 +505,7 @@
           </w:tcPr>
           <w:p>
             <w:r>
-              <w:t xml:space="preserve">{{ </w:t>
-            </w:r>
-            <w:proofErr w:type="spellStart"/>
-            <w:r>
-              <w:t>contact.email</w:t>
-            </w:r>
-            <w:proofErr w:type="spellEnd"/>
-            <w:r>
-              <w:t xml:space="preserve"> }}</w:t>
+              <w:t>{{ contact.email }}</w:t>
             </w:r>
           </w:p>
         </w:tc>
@@ -1093,15 +516,7 @@
           </w:tcPr>
           <w:p>
             <w:r>
-              <w:t xml:space="preserve">{{ </w:t>
-            </w:r>
-            <w:proofErr w:type="spellStart"/>
-            <w:r>
-              <w:t>contact.role</w:t>
-            </w:r>
-            <w:proofErr w:type="spellEnd"/>
-            <w:r>
-              <w:t xml:space="preserve"> | replace(‘_’, ‘ ‘)}}</w:t>
+              <w:t>{{ contact.role | replace(‘_’, ‘ ‘)}}</w:t>
             </w:r>
           </w:p>
         </w:tc>
@@ -1118,23 +533,7 @@
           </w:tcPr>
           <w:p>
             <w:r>
-              <w:t>{%</w:t>
-            </w:r>
-            <w:proofErr w:type="spellStart"/>
-            <w:r>
-              <w:t>tr</w:t>
-            </w:r>
-            <w:proofErr w:type="spellEnd"/>
-            <w:r>
-              <w:t xml:space="preserve"> </w:t>
-            </w:r>
-            <w:proofErr w:type="spellStart"/>
-            <w:r>
-              <w:t>endfor</w:t>
-            </w:r>
-            <w:proofErr w:type="spellEnd"/>
-            <w:r>
-              <w:t xml:space="preserve"> %}</w:t>
+              <w:t>{%tr endfor %}</w:t>
             </w:r>
           </w:p>
         </w:tc>
@@ -1143,15 +542,7 @@
     <w:p/>
     <w:p>
       <w:r>
-        <w:t xml:space="preserve">{%p </w:t>
-      </w:r>
-      <w:proofErr w:type="spellStart"/>
-      <w:r>
-        <w:t>endfor</w:t>
-      </w:r>
-      <w:proofErr w:type="spellEnd"/>
-      <w:r>
-        <w:t xml:space="preserve"> %}</w:t>
+        <w:t>{%p endfor %}</w:t>
       </w:r>
     </w:p>
     <w:p/>
@@ -1172,38 +563,12 @@
         <w:t xml:space="preserve">{% for </w:t>
       </w:r>
       <w:bookmarkStart w:id="2" w:name="__DdeLink__1192_3755231597"/>
-      <w:proofErr w:type="spellStart"/>
       <w:r>
         <w:t>datadec</w:t>
       </w:r>
       <w:bookmarkEnd w:id="2"/>
-      <w:proofErr w:type="spellEnd"/>
-      <w:r>
-        <w:t xml:space="preserve"> in </w:t>
-      </w:r>
-      <w:proofErr w:type="spellStart"/>
-      <w:r>
-        <w:t>datadecs</w:t>
-      </w:r>
-      <w:proofErr w:type="spellEnd"/>
-      <w:r>
-        <w:t xml:space="preserve"> %}{% set </w:t>
-      </w:r>
-      <w:proofErr w:type="spellStart"/>
-      <w:r>
-        <w:t>datadec_index</w:t>
-      </w:r>
-      <w:proofErr w:type="spellEnd"/>
-      <w:r>
-        <w:t xml:space="preserve"> = </w:t>
-      </w:r>
-      <w:proofErr w:type="spellStart"/>
-      <w:r>
-        <w:t>loop.index</w:t>
-      </w:r>
-      <w:proofErr w:type="spellEnd"/>
-      <w:r>
-        <w:t xml:space="preserve"> %}</w:t>
+      <w:r>
+        <w:t xml:space="preserve"> in datadecs %}{% set datadec_index = loop.index %}</w:t>
       </w:r>
     </w:p>
     <w:p>
@@ -1211,52 +576,12 @@
         <w:pStyle w:val="Heading3"/>
       </w:pPr>
       <w:r>
-        <w:t>Data {</w:t>
-      </w:r>
-      <w:proofErr w:type="gramStart"/>
-      <w:r>
-        <w:t xml:space="preserve">{ </w:t>
-      </w:r>
-      <w:proofErr w:type="spellStart"/>
-      <w:r>
-        <w:t>datadec</w:t>
-      </w:r>
-      <w:proofErr w:type="gramEnd"/>
-      <w:r>
-        <w:t>_index</w:t>
-      </w:r>
-      <w:proofErr w:type="spellEnd"/>
-      <w:r>
-        <w:t xml:space="preserve"> }}:  {{ </w:t>
-      </w:r>
-      <w:proofErr w:type="spellStart"/>
-      <w:r>
-        <w:t>datadec.title</w:t>
-      </w:r>
-      <w:proofErr w:type="spellEnd"/>
-      <w:r>
-        <w:t xml:space="preserve"> }}</w:t>
-      </w:r>
-    </w:p>
-    <w:p>
-      <w:r>
-        <w:t>Study or Cohort Reference: {</w:t>
-      </w:r>
-      <w:proofErr w:type="gramStart"/>
-      <w:r>
-        <w:t xml:space="preserve">{ </w:t>
-      </w:r>
-      <w:proofErr w:type="spellStart"/>
-      <w:r>
-        <w:t>datadec.source</w:t>
-      </w:r>
-      <w:proofErr w:type="gramEnd"/>
-      <w:r>
-        <w:t>_study</w:t>
-      </w:r>
-      <w:proofErr w:type="spellEnd"/>
-      <w:r>
-        <w:t xml:space="preserve"> }}</w:t>
+        <w:t>Data {{ datadec_index }}:  {{ datadec.title }}</w:t>
+      </w:r>
+    </w:p>
+    <w:p>
+      <w:r>
+        <w:t>Study or Cohort Reference: {{ datadec.source_study }}</w:t>
       </w:r>
     </w:p>
     <w:p>
@@ -1264,23 +589,7 @@
         <w:pStyle w:val="Heading4"/>
       </w:pPr>
       <w:r>
-        <w:t>Data {</w:t>
-      </w:r>
-      <w:proofErr w:type="gramStart"/>
-      <w:r>
-        <w:t xml:space="preserve">{ </w:t>
-      </w:r>
-      <w:proofErr w:type="spellStart"/>
-      <w:r>
-        <w:t>datadec</w:t>
-      </w:r>
-      <w:proofErr w:type="gramEnd"/>
-      <w:r>
-        <w:t>_index</w:t>
-      </w:r>
-      <w:proofErr w:type="spellEnd"/>
-      <w:r>
-        <w:t xml:space="preserve"> }} - Categories</w:t>
+        <w:t>Data {{ datadec_index }} - Categories</w:t>
       </w:r>
     </w:p>
     <w:p/>
@@ -1300,21 +609,7 @@
         <w:rPr>
           <w:rStyle w:val="NumberedListItem"/>
         </w:rPr>
-        <w:t xml:space="preserve">The Data{{ </w:t>
-      </w:r>
-      <w:proofErr w:type="spellStart"/>
-      <w:r>
-        <w:rPr>
-          <w:rStyle w:val="NumberedListItem"/>
-        </w:rPr>
-        <w:t>datadec_index</w:t>
-      </w:r>
-      <w:proofErr w:type="spellEnd"/>
-      <w:r>
-        <w:rPr>
-          <w:rStyle w:val="NumberedListItem"/>
-        </w:rPr>
-        <w:t xml:space="preserve"> }} includes the following categories and types of personal data:</w:t>
+        <w:t>The Data{{ datadec_index }} includes the following categories and types of personal data:</w:t>
       </w:r>
     </w:p>
     <w:p>
@@ -1329,21 +624,7 @@
         <w:rPr>
           <w:rStyle w:val="NumberedListItem"/>
         </w:rPr>
-        <w:t xml:space="preserve">{%p for category in </w:t>
-      </w:r>
-      <w:proofErr w:type="spellStart"/>
-      <w:r>
-        <w:rPr>
-          <w:rStyle w:val="NumberedListItem"/>
-        </w:rPr>
-        <w:t>datadec.gdpr_datatypes</w:t>
-      </w:r>
-      <w:proofErr w:type="spellEnd"/>
-      <w:r>
-        <w:rPr>
-          <w:rStyle w:val="NumberedListItem"/>
-        </w:rPr>
-        <w:t xml:space="preserve"> %}</w:t>
+        <w:t>{%p for category in datadec.gdpr_datatypes %}</w:t>
       </w:r>
     </w:p>
     <w:p>
@@ -1376,21 +657,7 @@
         <w:rPr>
           <w:rStyle w:val="NumberedListItem"/>
         </w:rPr>
-        <w:t xml:space="preserve">{%p </w:t>
-      </w:r>
-      <w:proofErr w:type="spellStart"/>
-      <w:r>
-        <w:rPr>
-          <w:rStyle w:val="NumberedListItem"/>
-        </w:rPr>
-        <w:t>endfor</w:t>
-      </w:r>
-      <w:proofErr w:type="spellEnd"/>
-      <w:r>
-        <w:rPr>
-          <w:rStyle w:val="NumberedListItem"/>
-        </w:rPr>
-        <w:t xml:space="preserve"> %}</w:t>
+        <w:t>{%p endfor %}</w:t>
       </w:r>
     </w:p>
     <w:p>
@@ -1402,69 +669,7 @@
         <w:rPr>
           <w:rStyle w:val="NumberedListItem"/>
         </w:rPr>
-        <w:t xml:space="preserve">{% if </w:t>
-      </w:r>
-      <w:proofErr w:type="spellStart"/>
-      <w:r>
-        <w:rPr>
-          <w:rStyle w:val="NumberedListItem"/>
-        </w:rPr>
-        <w:t>datadec.gdpr_datatypes_notes</w:t>
-      </w:r>
-      <w:proofErr w:type="spellEnd"/>
-      <w:r>
-        <w:rPr>
-          <w:rStyle w:val="NumberedListItem"/>
-        </w:rPr>
-        <w:t xml:space="preserve"> %}Remarks on categories </w:t>
-      </w:r>
-      <w:r>
-        <w:rPr>
-          <w:rStyle w:val="NumberedListItem"/>
-        </w:rPr>
-        <w:t>of personal datatypes: {</w:t>
-      </w:r>
-      <w:proofErr w:type="gramStart"/>
-      <w:r>
-        <w:rPr>
-          <w:rStyle w:val="NumberedListItem"/>
-        </w:rPr>
-        <w:t xml:space="preserve">{ </w:t>
-      </w:r>
-      <w:proofErr w:type="spellStart"/>
-      <w:r>
-        <w:rPr>
-          <w:rStyle w:val="NumberedListItem"/>
-        </w:rPr>
-        <w:t>datadec.gdpr</w:t>
-      </w:r>
-      <w:proofErr w:type="gramEnd"/>
-      <w:r>
-        <w:rPr>
-          <w:rStyle w:val="NumberedListItem"/>
-        </w:rPr>
-        <w:t>_datatypes_notes</w:t>
-      </w:r>
-      <w:proofErr w:type="spellEnd"/>
-      <w:r>
-        <w:rPr>
-          <w:rStyle w:val="NumberedListItem"/>
-        </w:rPr>
-        <w:t xml:space="preserve"> }}{% </w:t>
-      </w:r>
-      <w:proofErr w:type="spellStart"/>
-      <w:r>
-        <w:rPr>
-          <w:rStyle w:val="NumberedListItem"/>
-        </w:rPr>
-        <w:t>endif</w:t>
-      </w:r>
-      <w:proofErr w:type="spellEnd"/>
-      <w:r>
-        <w:rPr>
-          <w:rStyle w:val="NumberedListItem"/>
-        </w:rPr>
-        <w:t xml:space="preserve"> %}</w:t>
+        <w:t>{% if datadec.gdpr_datatypes_notes %}Remarks on categories of personal datatypes: {{ datadec.gdpr_datatypes_notes }}{% endif %}</w:t>
       </w:r>
     </w:p>
     <w:p>
@@ -1482,21 +687,7 @@
         <w:rPr>
           <w:rStyle w:val="NumberedListItem"/>
         </w:rPr>
-        <w:t xml:space="preserve">The Data{{ </w:t>
-      </w:r>
-      <w:proofErr w:type="spellStart"/>
-      <w:r>
-        <w:rPr>
-          <w:rStyle w:val="NumberedListItem"/>
-        </w:rPr>
-        <w:t>datadec_index</w:t>
-      </w:r>
-      <w:proofErr w:type="spellEnd"/>
-      <w:r>
-        <w:rPr>
-          <w:rStyle w:val="NumberedListItem"/>
-        </w:rPr>
-        <w:t xml:space="preserve"> }} contains the following scientific datatypes:</w:t>
+        <w:t>The Data{{ datadec_index }} contains the following scientific datatypes:</w:t>
       </w:r>
     </w:p>
     <w:p>
@@ -1511,21 +702,7 @@
         <w:rPr>
           <w:rStyle w:val="NumberedListItem"/>
         </w:rPr>
-        <w:t xml:space="preserve">{%p for category in </w:t>
-      </w:r>
-      <w:proofErr w:type="spellStart"/>
-      <w:r>
-        <w:rPr>
-          <w:rStyle w:val="NumberedListItem"/>
-        </w:rPr>
-        <w:t>datadec.sci_datatypes</w:t>
-      </w:r>
-      <w:proofErr w:type="spellEnd"/>
-      <w:r>
-        <w:rPr>
-          <w:rStyle w:val="NumberedListItem"/>
-        </w:rPr>
-        <w:t xml:space="preserve"> %}</w:t>
+        <w:t>{%p for category in datadec.sci_datatypes %}</w:t>
       </w:r>
     </w:p>
     <w:p>
@@ -1540,8 +717,6 @@
           <w:rFonts w:cs="Times New Roman"/>
         </w:rPr>
       </w:pPr>
-      <w:bookmarkStart w:id="3" w:name="_GoBack"/>
-      <w:bookmarkEnd w:id="3"/>
       <w:r>
         <w:rPr>
           <w:rStyle w:val="NumberedListItem"/>
@@ -1564,23 +739,7 @@
           <w:rStyle w:val="NumberedListItem"/>
           <w:rFonts w:cs="Times New Roman"/>
         </w:rPr>
-        <w:t xml:space="preserve">{%p </w:t>
-      </w:r>
-      <w:proofErr w:type="spellStart"/>
-      <w:r>
-        <w:rPr>
-          <w:rStyle w:val="NumberedListItem"/>
-          <w:rFonts w:cs="Times New Roman"/>
-        </w:rPr>
-        <w:t>endfor</w:t>
-      </w:r>
-      <w:proofErr w:type="spellEnd"/>
-      <w:r>
-        <w:rPr>
-          <w:rStyle w:val="NumberedListItem"/>
-          <w:rFonts w:cs="Times New Roman"/>
-        </w:rPr>
-        <w:t xml:space="preserve"> %}</w:t>
+        <w:t>{%p endfor %}</w:t>
       </w:r>
     </w:p>
     <w:p>
@@ -1596,69 +755,7 @@
           <w:rStyle w:val="NumberedListItem"/>
         </w:rPr>
         <w:lastRenderedPageBreak/>
-        <w:t xml:space="preserve">{% if </w:t>
-      </w:r>
-      <w:proofErr w:type="spellStart"/>
-      <w:r>
-        <w:rPr>
-          <w:rStyle w:val="NumberedListItem"/>
-        </w:rPr>
-        <w:t>datadec.sci_datatypes_notes</w:t>
-      </w:r>
-      <w:proofErr w:type="spellEnd"/>
-      <w:r>
-        <w:rPr>
-          <w:rStyle w:val="NumberedListItem"/>
-        </w:rPr>
-        <w:t xml:space="preserve"> </w:t>
-      </w:r>
-      <w:r>
-        <w:rPr>
-          <w:rStyle w:val="NumberedListItem"/>
-        </w:rPr>
-        <w:t>%}Remarks on categories scientific datatypes: {</w:t>
-      </w:r>
-      <w:proofErr w:type="gramStart"/>
-      <w:r>
-        <w:rPr>
-          <w:rStyle w:val="NumberedListItem"/>
-        </w:rPr>
-        <w:t xml:space="preserve">{ </w:t>
-      </w:r>
-      <w:proofErr w:type="spellStart"/>
-      <w:r>
-        <w:rPr>
-          <w:rStyle w:val="NumberedListItem"/>
-        </w:rPr>
-        <w:t>datadec.sci</w:t>
-      </w:r>
-      <w:proofErr w:type="gramEnd"/>
-      <w:r>
-        <w:rPr>
-          <w:rStyle w:val="NumberedListItem"/>
-        </w:rPr>
-        <w:t>_datatypes_notes</w:t>
-      </w:r>
-      <w:proofErr w:type="spellEnd"/>
-      <w:r>
-        <w:rPr>
-          <w:rStyle w:val="NumberedListItem"/>
-        </w:rPr>
-        <w:t xml:space="preserve"> }}{% </w:t>
-      </w:r>
-      <w:proofErr w:type="spellStart"/>
-      <w:r>
-        <w:rPr>
-          <w:rStyle w:val="NumberedListItem"/>
-        </w:rPr>
-        <w:t>endif</w:t>
-      </w:r>
-      <w:proofErr w:type="spellEnd"/>
-      <w:r>
-        <w:rPr>
-          <w:rStyle w:val="NumberedListItem"/>
-        </w:rPr>
-        <w:t xml:space="preserve"> %}</w:t>
+        <w:t>{% if datadec.sci_datatypes_notes %}Remarks on categories scientific datatypes: {{ datadec.sci_datatypes_notes }}{% endif %}</w:t>
       </w:r>
     </w:p>
     <w:p>
@@ -1676,35 +773,7 @@
         <w:rPr>
           <w:rStyle w:val="NumberedListItem"/>
         </w:rPr>
-        <w:t>Data is {</w:t>
-      </w:r>
-      <w:proofErr w:type="gramStart"/>
-      <w:r>
-        <w:rPr>
-          <w:rStyle w:val="NumberedListItem"/>
-        </w:rPr>
-        <w:t xml:space="preserve">{ </w:t>
-      </w:r>
-      <w:proofErr w:type="spellStart"/>
-      <w:r>
-        <w:rPr>
-          <w:rStyle w:val="NumberedListItem"/>
-        </w:rPr>
-        <w:t>datadec.de</w:t>
-      </w:r>
-      <w:proofErr w:type="gramEnd"/>
-      <w:r>
-        <w:rPr>
-          <w:rStyle w:val="NumberedListItem"/>
-        </w:rPr>
-        <w:t>_identification</w:t>
-      </w:r>
-      <w:proofErr w:type="spellEnd"/>
-      <w:r>
-        <w:rPr>
-          <w:rStyle w:val="NumberedListItem"/>
-        </w:rPr>
-        <w:t xml:space="preserve"> }}.</w:t>
+        <w:t>Data is {{ datadec.de_identification }}.</w:t>
       </w:r>
     </w:p>
     <w:p>
@@ -1722,83 +791,7 @@
         <w:rPr>
           <w:rStyle w:val="NumberedListItem"/>
         </w:rPr>
-        <w:t>In addition to Data {</w:t>
-      </w:r>
-      <w:proofErr w:type="gramStart"/>
-      <w:r>
-        <w:rPr>
-          <w:rStyle w:val="NumberedListItem"/>
-        </w:rPr>
-        <w:t xml:space="preserve">{ </w:t>
-      </w:r>
-      <w:proofErr w:type="spellStart"/>
-      <w:r>
-        <w:rPr>
-          <w:rStyle w:val="NumberedListItem"/>
-        </w:rPr>
-        <w:t>datadec</w:t>
-      </w:r>
-      <w:proofErr w:type="gramEnd"/>
-      <w:r>
-        <w:rPr>
-          <w:rStyle w:val="NumberedListItem"/>
-        </w:rPr>
-        <w:t>_index</w:t>
-      </w:r>
-      <w:proofErr w:type="spellEnd"/>
-      <w:r>
-        <w:rPr>
-          <w:rStyle w:val="NumberedListItem"/>
-        </w:rPr>
-        <w:t xml:space="preserve"> }}, the Data Provider will {% if </w:t>
-      </w:r>
-      <w:proofErr w:type="spellStart"/>
-      <w:r>
-        <w:rPr>
-          <w:rStyle w:val="NumberedListItem"/>
-        </w:rPr>
-        <w:t>datadec.has_samples</w:t>
-      </w:r>
-      <w:proofErr w:type="spellEnd"/>
-      <w:r>
-        <w:rPr>
-          <w:rStyle w:val="NumberedListItem"/>
-        </w:rPr>
-        <w:t xml:space="preserve"> %} submit bio-samples of following</w:t>
-      </w:r>
-      <w:r>
-        <w:rPr>
-          <w:rStyle w:val="NumberedListItem"/>
-        </w:rPr>
-        <w:t xml:space="preserve"> nature: {{</w:t>
-      </w:r>
-      <w:proofErr w:type="spellStart"/>
-      <w:r>
-        <w:rPr>
-          <w:rStyle w:val="NumberedListItem"/>
-        </w:rPr>
-        <w:t>datadec.samples_notes</w:t>
-      </w:r>
-      <w:proofErr w:type="spellEnd"/>
-      <w:r>
-        <w:rPr>
-          <w:rStyle w:val="NumberedListItem"/>
-        </w:rPr>
-        <w:t xml:space="preserve">}} {% else %} not submit any bio-samples{% </w:t>
-      </w:r>
-      <w:proofErr w:type="spellStart"/>
-      <w:r>
-        <w:rPr>
-          <w:rStyle w:val="NumberedListItem"/>
-        </w:rPr>
-        <w:t>endif</w:t>
-      </w:r>
-      <w:proofErr w:type="spellEnd"/>
-      <w:r>
-        <w:rPr>
-          <w:rStyle w:val="NumberedListItem"/>
-        </w:rPr>
-        <w:t xml:space="preserve"> %}.</w:t>
+        <w:t>In addition to Data {{ datadec_index }}, the Data Provider will {% if datadec.has_samples %} submit bio-samples of following nature: {{datadec.samples_notes}} {% else %} not submit any bio-samples{% endif %}.</w:t>
       </w:r>
     </w:p>
     <w:p>
@@ -1806,23 +799,7 @@
         <w:pStyle w:val="Heading4"/>
       </w:pPr>
       <w:r>
-        <w:t>Data {</w:t>
-      </w:r>
-      <w:proofErr w:type="gramStart"/>
-      <w:r>
-        <w:t xml:space="preserve">{ </w:t>
-      </w:r>
-      <w:proofErr w:type="spellStart"/>
-      <w:r>
-        <w:t>datadec</w:t>
-      </w:r>
-      <w:proofErr w:type="gramEnd"/>
-      <w:r>
-        <w:t>_index</w:t>
-      </w:r>
-      <w:proofErr w:type="spellEnd"/>
-      <w:r>
-        <w:t xml:space="preserve"> }} - Lawfulness and Legitimacy of Processing</w:t>
+        <w:t>Data {{ datadec_index }} - Lawfulness and Legitimacy of Processing</w:t>
       </w:r>
     </w:p>
     <w:p>
@@ -1840,47 +817,13 @@
         <w:rPr>
           <w:rStyle w:val="NumberedListItem"/>
         </w:rPr>
-        <w:t>For standard (non-sensitive) personal data, the legal basis according to Art. 6.1 GDPR for the collectio</w:t>
-      </w:r>
-      <w:r>
-        <w:rPr>
-          <w:rStyle w:val="NumberedListItem"/>
-        </w:rPr>
-        <w:t>n of personal data is {</w:t>
-      </w:r>
-      <w:proofErr w:type="gramStart"/>
-      <w:r>
-        <w:rPr>
-          <w:rStyle w:val="NumberedListItem"/>
-        </w:rPr>
-        <w:t xml:space="preserve">{ </w:t>
-      </w:r>
-      <w:proofErr w:type="spellStart"/>
-      <w:r>
-        <w:rPr>
-          <w:rStyle w:val="NumberedListItem"/>
-        </w:rPr>
-        <w:t>datadec.legal</w:t>
-      </w:r>
-      <w:proofErr w:type="gramEnd"/>
-      <w:r>
-        <w:rPr>
-          <w:rStyle w:val="NumberedListItem"/>
-        </w:rPr>
-        <w:t>_basis_</w:t>
-      </w:r>
-      <w:r>
-        <w:rPr>
-          <w:rStyle w:val="NumberedListItem"/>
-        </w:rPr>
-        <w:t>data_collection_std</w:t>
-      </w:r>
-      <w:proofErr w:type="spellEnd"/>
-      <w:r>
-        <w:rPr>
-          <w:rStyle w:val="NumberedListItem"/>
-        </w:rPr>
-        <w:t xml:space="preserve"> }}</w:t>
+        <w:t>For standard (non-sensitive) personal data, the legal basis according to Art. 6.1 GDPR for the collection of personal data is {{ datadec.legal_basis_</w:t>
+      </w:r>
+      <w:r>
+        <w:rPr>
+          <w:rStyle w:val="NumberedListItem"/>
+        </w:rPr>
+        <w:t>data_collection_std }}</w:t>
       </w:r>
       <w:r>
         <w:rPr>
@@ -1904,41 +847,7 @@
         <w:rPr>
           <w:rStyle w:val="NumberedListItem"/>
         </w:rPr>
-        <w:t>For standard (non-sensitive) personal data, the legal basis according to Art. 6.1 GDPR for the sharing and subsequent processing of personal data is {</w:t>
-      </w:r>
-      <w:proofErr w:type="gramStart"/>
-      <w:r>
-        <w:rPr>
-          <w:rStyle w:val="NumberedListItem"/>
-        </w:rPr>
-        <w:t xml:space="preserve">{ </w:t>
-      </w:r>
-      <w:proofErr w:type="spellStart"/>
-      <w:r>
-        <w:rPr>
-          <w:rStyle w:val="NumberedListItem"/>
-        </w:rPr>
-        <w:t>datadec.legal</w:t>
-      </w:r>
-      <w:proofErr w:type="gramEnd"/>
-      <w:r>
-        <w:rPr>
-          <w:rStyle w:val="NumberedListItem"/>
-        </w:rPr>
-        <w:t>_basis_data_</w:t>
-      </w:r>
-      <w:r>
-        <w:rPr>
-          <w:rStyle w:val="NumberedListItem"/>
-        </w:rPr>
-        <w:t>sharing_std</w:t>
-      </w:r>
-      <w:proofErr w:type="spellEnd"/>
-      <w:r>
-        <w:rPr>
-          <w:rStyle w:val="NumberedListItem"/>
-        </w:rPr>
-        <w:t xml:space="preserve"> }}.</w:t>
+        <w:t>For standard (non-sensitive) personal data, the legal basis according to Art. 6.1 GDPR for the sharing and subsequent processing of personal data is {{ datadec.legal_basis_data_sharing_std }}.</w:t>
       </w:r>
     </w:p>
     <w:p>
@@ -1956,35 +865,7 @@
         <w:rPr>
           <w:rStyle w:val="NumberedListItem"/>
         </w:rPr>
-        <w:t>For special category (sensitive) personal data, the legal basis according to Art. 6.1 GDPR for the collection of personal data is {</w:t>
-      </w:r>
-      <w:proofErr w:type="gramStart"/>
-      <w:r>
-        <w:rPr>
-          <w:rStyle w:val="NumberedListItem"/>
-        </w:rPr>
-        <w:t xml:space="preserve">{ </w:t>
-      </w:r>
-      <w:proofErr w:type="spellStart"/>
-      <w:r>
-        <w:rPr>
-          <w:rStyle w:val="NumberedListItem"/>
-        </w:rPr>
-        <w:t>datadec.legal</w:t>
-      </w:r>
-      <w:proofErr w:type="gramEnd"/>
-      <w:r>
-        <w:rPr>
-          <w:rStyle w:val="NumberedListItem"/>
-        </w:rPr>
-        <w:t>_basis_data_collection_spec</w:t>
-      </w:r>
-      <w:proofErr w:type="spellEnd"/>
-      <w:r>
-        <w:rPr>
-          <w:rStyle w:val="NumberedListItem"/>
-        </w:rPr>
-        <w:t xml:space="preserve"> }}.</w:t>
+        <w:t>For special category (sensitive) personal data, the legal basis according to Art. 6.1 GDPR for the collection of personal data is {{ datadec.legal_basis_data_collection_spec }}.</w:t>
       </w:r>
     </w:p>
     <w:p>
@@ -2002,27 +883,7 @@
         <w:rPr>
           <w:rStyle w:val="NumberedListItem"/>
         </w:rPr>
-        <w:t>For special category (sensitive) personal data, the legal basi</w:t>
-      </w:r>
-      <w:r>
-        <w:rPr>
-          <w:rStyle w:val="NumberedListItem"/>
-        </w:rPr>
-        <w:t xml:space="preserve">s according to Art. 6.1 GDPR for the sharing and subsequent processing of personal data is {{ </w:t>
-      </w:r>
-      <w:proofErr w:type="spellStart"/>
-      <w:r>
-        <w:rPr>
-          <w:rStyle w:val="NumberedListItem"/>
-        </w:rPr>
-        <w:t>datadec.legal_basis_data_sharing_spec</w:t>
-      </w:r>
-      <w:proofErr w:type="spellEnd"/>
-      <w:r>
-        <w:rPr>
-          <w:rStyle w:val="NumberedListItem"/>
-        </w:rPr>
-        <w:t xml:space="preserve"> }}</w:t>
+        <w:t>For special category (sensitive) personal data, the legal basis according to Art. 6.1 GDPR for the sharing and subsequent processing of personal data is {{ datadec.legal_basis_data_sharing_spec }}</w:t>
       </w:r>
     </w:p>
     <w:p>
@@ -2037,21 +898,7 @@
         <w:rPr>
           <w:rStyle w:val="NumberedListItem"/>
         </w:rPr>
-        <w:t xml:space="preserve">{% if </w:t>
-      </w:r>
-      <w:proofErr w:type="spellStart"/>
-      <w:r>
-        <w:rPr>
-          <w:rStyle w:val="NumberedListItem"/>
-        </w:rPr>
-        <w:t>datadec.legal_basis_notes</w:t>
-      </w:r>
-      <w:proofErr w:type="spellEnd"/>
-      <w:r>
-        <w:rPr>
-          <w:rStyle w:val="NumberedListItem"/>
-        </w:rPr>
-        <w:t xml:space="preserve"> %}</w:t>
+        <w:t>{% if datadec.legal_basis_notes %}</w:t>
       </w:r>
     </w:p>
     <w:p>
@@ -2069,41 +916,7 @@
         <w:rPr>
           <w:rStyle w:val="NumberedListItem"/>
         </w:rPr>
-        <w:t xml:space="preserve">For special category (sensitive) personal data, the legal basis specified under 7. </w:t>
-      </w:r>
-      <w:r>
-        <w:rPr>
-          <w:rStyle w:val="NumberedListItem"/>
-        </w:rPr>
-        <w:t xml:space="preserve">and/or 8. </w:t>
-      </w:r>
-      <w:proofErr w:type="gramStart"/>
-      <w:r>
-        <w:rPr>
-          <w:rStyle w:val="NumberedListItem"/>
-        </w:rPr>
-        <w:t>affects</w:t>
-      </w:r>
-      <w:proofErr w:type="gramEnd"/>
-      <w:r>
-        <w:rPr>
-          <w:rStyle w:val="NumberedListItem"/>
-        </w:rPr>
-        <w:t xml:space="preserve"> only a subset of sensitive data, specifically: {{ </w:t>
-      </w:r>
-      <w:proofErr w:type="spellStart"/>
-      <w:r>
-        <w:rPr>
-          <w:rStyle w:val="NumberedListItem"/>
-        </w:rPr>
-        <w:t>datadec.legal_basis_notes</w:t>
-      </w:r>
-      <w:proofErr w:type="spellEnd"/>
-      <w:r>
-        <w:rPr>
-          <w:rStyle w:val="NumberedListItem"/>
-        </w:rPr>
-        <w:t xml:space="preserve"> }}.</w:t>
+        <w:t>For special category (sensitive) personal data, the legal basis specified under 7. and/or 8. affects only a subset of sensitive data, specifically: {{ datadec.legal_basis_notes }}.</w:t>
       </w:r>
     </w:p>
     <w:p>
@@ -2118,21 +931,7 @@
         <w:rPr>
           <w:rStyle w:val="NumberedListItem"/>
         </w:rPr>
-        <w:t xml:space="preserve">{% </w:t>
-      </w:r>
-      <w:proofErr w:type="spellStart"/>
-      <w:r>
-        <w:rPr>
-          <w:rStyle w:val="NumberedListItem"/>
-        </w:rPr>
-        <w:t>endif</w:t>
-      </w:r>
-      <w:proofErr w:type="spellEnd"/>
-      <w:r>
-        <w:rPr>
-          <w:rStyle w:val="NumberedListItem"/>
-        </w:rPr>
-        <w:t xml:space="preserve"> %}</w:t>
+        <w:t>{% endif %}</w:t>
       </w:r>
     </w:p>
     <w:p>
@@ -2140,23 +939,7 @@
         <w:pStyle w:val="Heading4"/>
       </w:pPr>
       <w:r>
-        <w:t>Data {</w:t>
-      </w:r>
-      <w:proofErr w:type="gramStart"/>
-      <w:r>
-        <w:t xml:space="preserve">{ </w:t>
-      </w:r>
-      <w:proofErr w:type="spellStart"/>
-      <w:r>
-        <w:t>datadec</w:t>
-      </w:r>
-      <w:proofErr w:type="gramEnd"/>
-      <w:r>
-        <w:t>_index</w:t>
-      </w:r>
-      <w:proofErr w:type="spellEnd"/>
-      <w:r>
-        <w:t xml:space="preserve"> }} – Data Subjects</w:t>
+        <w:t>Data {{ datadec_index }} – Data Subjects</w:t>
       </w:r>
     </w:p>
     <w:p>
@@ -2171,21 +954,7 @@
         <w:rPr>
           <w:rStyle w:val="NumberedListItem"/>
         </w:rPr>
-        <w:t>The Data Subjects category comprises {{</w:t>
-      </w:r>
-      <w:proofErr w:type="spellStart"/>
-      <w:r>
-        <w:rPr>
-          <w:rStyle w:val="NumberedListItem"/>
-        </w:rPr>
-        <w:t>datadec.subject_categories</w:t>
-      </w:r>
-      <w:proofErr w:type="spellEnd"/>
-      <w:r>
-        <w:rPr>
-          <w:rStyle w:val="NumberedListItem"/>
-        </w:rPr>
-        <w:t>}}.</w:t>
+        <w:t>The Data Subjects category comprises {{datadec.subject_categories}}.</w:t>
       </w:r>
     </w:p>
     <w:p>
@@ -2203,55 +972,7 @@
         <w:rPr>
           <w:rStyle w:val="NumberedListItem"/>
         </w:rPr>
-        <w:t xml:space="preserve">The Dataset does {% if </w:t>
-      </w:r>
-      <w:proofErr w:type="spellStart"/>
-      <w:r>
-        <w:rPr>
-          <w:rStyle w:val="NumberedListItem"/>
-        </w:rPr>
-        <w:t>datadec.has_s</w:t>
-      </w:r>
-      <w:r>
-        <w:rPr>
-          <w:rStyle w:val="NumberedListItem"/>
-        </w:rPr>
-        <w:t>pecial_subjects</w:t>
-      </w:r>
-      <w:proofErr w:type="spellEnd"/>
-      <w:r>
-        <w:rPr>
-          <w:rStyle w:val="NumberedListItem"/>
-        </w:rPr>
-        <w:t xml:space="preserve"> %</w:t>
-      </w:r>
-      <w:proofErr w:type="gramStart"/>
-      <w:r>
-        <w:rPr>
-          <w:rStyle w:val="NumberedListItem"/>
-        </w:rPr>
-        <w:t>}contain</w:t>
-      </w:r>
-      <w:proofErr w:type="gramEnd"/>
-      <w:r>
-        <w:rPr>
-          <w:rStyle w:val="NumberedListItem"/>
-        </w:rPr>
-        <w:t xml:space="preserve"> Data from “Special Subjects”, meaning minors or subjects unable to give consent. {% else %}not contain Data from “Special Subjects”, meaning minors or subjects unable to give consent.{% </w:t>
-      </w:r>
-      <w:proofErr w:type="spellStart"/>
-      <w:r>
-        <w:rPr>
-          <w:rStyle w:val="NumberedListItem"/>
-        </w:rPr>
-        <w:t>endif</w:t>
-      </w:r>
-      <w:proofErr w:type="spellEnd"/>
-      <w:r>
-        <w:rPr>
-          <w:rStyle w:val="NumberedListItem"/>
-        </w:rPr>
-        <w:t xml:space="preserve"> %}</w:t>
+        <w:t>The Dataset does {% if datadec.has_special_subjects %}contain Data from “Special Subjects”, meaning minors or subjects unable to give consent. {% else %}not contain Data from “Special Subjects”, meaning minors or subjects unable to give consent.{% endif %}</w:t>
       </w:r>
     </w:p>
     <w:p>
@@ -2259,23 +980,7 @@
         <w:pStyle w:val="Heading4"/>
       </w:pPr>
       <w:r>
-        <w:t>Data {</w:t>
-      </w:r>
-      <w:proofErr w:type="gramStart"/>
-      <w:r>
-        <w:t xml:space="preserve">{ </w:t>
-      </w:r>
-      <w:proofErr w:type="spellStart"/>
-      <w:r>
-        <w:t>datadec</w:t>
-      </w:r>
-      <w:proofErr w:type="gramEnd"/>
-      <w:r>
-        <w:t>_index</w:t>
-      </w:r>
-      <w:proofErr w:type="spellEnd"/>
-      <w:r>
-        <w:t xml:space="preserve"> }} – Consent</w:t>
+        <w:t>Data {{ datadec_index }} – Consent</w:t>
       </w:r>
     </w:p>
     <w:p>
@@ -2293,69 +998,7 @@
         <w:rPr>
           <w:rStyle w:val="NumberedListItem"/>
         </w:rPr>
-        <w:t xml:space="preserve">The Data may be used </w:t>
-      </w:r>
-      <w:proofErr w:type="gramStart"/>
-      <w:r>
-        <w:rPr>
-          <w:rStyle w:val="NumberedListItem"/>
-        </w:rPr>
-        <w:t>in{</w:t>
-      </w:r>
-      <w:proofErr w:type="gramEnd"/>
-      <w:r>
-        <w:rPr>
-          <w:rStyle w:val="NumberedListItem"/>
-        </w:rPr>
-        <w:t xml:space="preserve">% if </w:t>
-      </w:r>
-      <w:proofErr w:type="spellStart"/>
-      <w:r>
-        <w:rPr>
-          <w:rStyle w:val="NumberedListItem"/>
-        </w:rPr>
-        <w:t>datadec.restriction_rs</w:t>
-      </w:r>
-      <w:proofErr w:type="spellEnd"/>
-      <w:r>
-        <w:rPr>
-          <w:rStyle w:val="NumberedListItem"/>
-        </w:rPr>
-        <w:t xml:space="preserve"> </w:t>
-      </w:r>
-      <w:r>
-        <w:rPr>
-          <w:rStyle w:val="NumberedListItem"/>
-        </w:rPr>
-        <w:t xml:space="preserve">%} only specific {% else %} all{% </w:t>
-      </w:r>
-      <w:proofErr w:type="spellStart"/>
-      <w:r>
-        <w:rPr>
-          <w:rStyle w:val="NumberedListItem"/>
-        </w:rPr>
-        <w:t>endif</w:t>
-      </w:r>
-      <w:proofErr w:type="spellEnd"/>
-      <w:r>
-        <w:rPr>
-          <w:rStyle w:val="NumberedListItem"/>
-        </w:rPr>
-        <w:t xml:space="preserve"> %} research/disease areas. {{ </w:t>
-      </w:r>
-      <w:proofErr w:type="spellStart"/>
-      <w:r>
-        <w:rPr>
-          <w:rStyle w:val="NumberedListItem"/>
-        </w:rPr>
-        <w:t>datadec.restriction_rs_notes</w:t>
-      </w:r>
-      <w:proofErr w:type="spellEnd"/>
-      <w:r>
-        <w:rPr>
-          <w:rStyle w:val="NumberedListItem"/>
-        </w:rPr>
-        <w:t xml:space="preserve"> }}</w:t>
+        <w:t>The Data may be used in{% if datadec.restriction_rs %} only specific {% else %} all{% endif %} research/disease areas. {{ datadec.restriction_rs_notes }}</w:t>
       </w:r>
     </w:p>
     <w:p>
@@ -2373,55 +1016,7 @@
         <w:rPr>
           <w:rStyle w:val="NumberedListItem"/>
         </w:rPr>
-        <w:t xml:space="preserve">The Data may be used {% if </w:t>
-      </w:r>
-      <w:proofErr w:type="spellStart"/>
-      <w:r>
-        <w:rPr>
-          <w:rStyle w:val="NumberedListItem"/>
-        </w:rPr>
-        <w:t>datadec.restriction_rs</w:t>
-      </w:r>
-      <w:proofErr w:type="spellEnd"/>
-      <w:r>
-        <w:rPr>
-          <w:rStyle w:val="NumberedListItem"/>
-        </w:rPr>
-        <w:t xml:space="preserve"> %}with the following geographic restrictions: {{ </w:t>
-      </w:r>
-      <w:proofErr w:type="spellStart"/>
-      <w:r>
-        <w:rPr>
-          <w:rStyle w:val="NumberedListItem"/>
-        </w:rPr>
-        <w:t>dat</w:t>
-      </w:r>
-      <w:r>
-        <w:rPr>
-          <w:rStyle w:val="NumberedListItem"/>
-        </w:rPr>
-        <w:t>adec.restriction_gs_notes</w:t>
-      </w:r>
-      <w:proofErr w:type="spellEnd"/>
-      <w:r>
-        <w:rPr>
-          <w:rStyle w:val="NumberedListItem"/>
-        </w:rPr>
-        <w:t xml:space="preserve"> }}{% else %}without geographic restrictions.{% </w:t>
-      </w:r>
-      <w:proofErr w:type="spellStart"/>
-      <w:r>
-        <w:rPr>
-          <w:rStyle w:val="NumberedListItem"/>
-        </w:rPr>
-        <w:t>endif</w:t>
-      </w:r>
-      <w:proofErr w:type="spellEnd"/>
-      <w:r>
-        <w:rPr>
-          <w:rStyle w:val="NumberedListItem"/>
-        </w:rPr>
-        <w:t xml:space="preserve"> %}</w:t>
+        <w:t>The Data may be used {% if datadec.restriction_rs %}with the following geographic restrictions: {{ datadec.restriction_gs_notes }}{% else %}without geographic restrictions.{% endif %}</w:t>
       </w:r>
     </w:p>
     <w:p>
@@ -2436,55 +1031,7 @@
         <w:rPr>
           <w:rStyle w:val="NumberedListItem"/>
         </w:rPr>
-        <w:t xml:space="preserve">The Data may be shared {% if </w:t>
-      </w:r>
-      <w:proofErr w:type="spellStart"/>
-      <w:r>
-        <w:rPr>
-          <w:rStyle w:val="NumberedListItem"/>
-        </w:rPr>
-        <w:t>datadec.restriction_us</w:t>
-      </w:r>
-      <w:proofErr w:type="spellEnd"/>
-      <w:r>
-        <w:rPr>
-          <w:rStyle w:val="NumberedListItem"/>
-        </w:rPr>
-        <w:t xml:space="preserve"> %} with the following restriction of recipients: {{ </w:t>
-      </w:r>
-      <w:proofErr w:type="spellStart"/>
-      <w:r>
-        <w:rPr>
-          <w:rStyle w:val="NumberedListItem"/>
-        </w:rPr>
-        <w:t>datadec.restriction_us_notes</w:t>
-      </w:r>
-      <w:proofErr w:type="spellEnd"/>
-      <w:r>
-        <w:rPr>
-          <w:rStyle w:val="NumberedListItem"/>
-        </w:rPr>
-        <w:t xml:space="preserve"> }}{% else %} without restriction of recip</w:t>
-      </w:r>
-      <w:r>
-        <w:rPr>
-          <w:rStyle w:val="NumberedListItem"/>
-        </w:rPr>
-        <w:t xml:space="preserve">ients.{% </w:t>
-      </w:r>
-      <w:proofErr w:type="spellStart"/>
-      <w:r>
-        <w:rPr>
-          <w:rStyle w:val="NumberedListItem"/>
-        </w:rPr>
-        <w:t>endif</w:t>
-      </w:r>
-      <w:proofErr w:type="spellEnd"/>
-      <w:r>
-        <w:rPr>
-          <w:rStyle w:val="NumberedListItem"/>
-        </w:rPr>
-        <w:t xml:space="preserve"> %}</w:t>
+        <w:t>The Data may be shared {% if datadec.restriction_us %} with the following restriction of recipients: {{ datadec.restriction_us_notes }}{% else %} without restriction of recipients.{% endif %}</w:t>
       </w:r>
     </w:p>
     <w:p>
@@ -2502,21 +1049,7 @@
         <w:rPr>
           <w:rStyle w:val="NumberedListItem"/>
         </w:rPr>
-        <w:t>The consents are {{</w:t>
-      </w:r>
-      <w:proofErr w:type="spellStart"/>
-      <w:r>
-        <w:rPr>
-          <w:rStyle w:val="NumberedListItem"/>
-        </w:rPr>
-        <w:t>datadec.consent_status</w:t>
-      </w:r>
-      <w:proofErr w:type="spellEnd"/>
-      <w:r>
-        <w:rPr>
-          <w:rStyle w:val="NumberedListItem"/>
-        </w:rPr>
-        <w:t>}}.</w:t>
+        <w:t>The consents are {{datadec.consent_status}}.</w:t>
       </w:r>
     </w:p>
     <w:p>
@@ -2524,23 +1057,7 @@
         <w:pStyle w:val="Heading4"/>
       </w:pPr>
       <w:r>
-        <w:t>Data {</w:t>
-      </w:r>
-      <w:proofErr w:type="gramStart"/>
-      <w:r>
-        <w:t xml:space="preserve">{ </w:t>
-      </w:r>
-      <w:proofErr w:type="spellStart"/>
-      <w:r>
-        <w:t>datadec</w:t>
-      </w:r>
-      <w:proofErr w:type="gramEnd"/>
-      <w:r>
-        <w:t>_index</w:t>
-      </w:r>
-      <w:proofErr w:type="spellEnd"/>
-      <w:r>
-        <w:t xml:space="preserve"> }}</w:t>
+        <w:t>Data {{ datadec_index }}</w:t>
       </w:r>
       <w:r>
         <w:t xml:space="preserve"> - Specific Use Conditions</w:t>
@@ -2587,14 +1104,12 @@
         </w:rPr>
         <w:t xml:space="preserve"> </w:t>
       </w:r>
-      <w:proofErr w:type="spellStart"/>
       <w:r>
         <w:rPr>
           <w:rStyle w:val="NumberedListItem"/>
         </w:rPr>
         <w:t>datadec.restriction_ps</w:t>
       </w:r>
-      <w:proofErr w:type="spellEnd"/>
       <w:r>
         <w:rPr>
           <w:rStyle w:val="NumberedListItem"/>
@@ -2629,21 +1144,7 @@
         <w:rPr>
           <w:rStyle w:val="NumberedListItem"/>
         </w:rPr>
-        <w:t xml:space="preserve">{% </w:t>
-      </w:r>
-      <w:proofErr w:type="spellStart"/>
-      <w:r>
-        <w:rPr>
-          <w:rStyle w:val="NumberedListItem"/>
-        </w:rPr>
-        <w:t>endif</w:t>
-      </w:r>
-      <w:proofErr w:type="spellEnd"/>
-      <w:r>
-        <w:rPr>
-          <w:rStyle w:val="NumberedListItem"/>
-        </w:rPr>
-        <w:t xml:space="preserve"> %}</w:t>
+        <w:t>{% endif %}</w:t>
       </w:r>
       <w:r>
         <w:rPr>
@@ -2667,27 +1168,7 @@
         <w:rPr>
           <w:rStyle w:val="NumberedListItem"/>
         </w:rPr>
-        <w:t xml:space="preserve"> {{ </w:t>
-      </w:r>
-      <w:proofErr w:type="spellStart"/>
-      <w:r>
-        <w:rPr>
-          <w:rStyle w:val="NumberedListItem"/>
-        </w:rPr>
-        <w:t>datadec.restriction_p</w:t>
-      </w:r>
-      <w:r>
-        <w:rPr>
-          <w:rStyle w:val="NumberedListItem"/>
-        </w:rPr>
-        <w:t>s_notes</w:t>
-      </w:r>
-      <w:proofErr w:type="spellEnd"/>
-      <w:r>
-        <w:rPr>
-          <w:rStyle w:val="NumberedListItem"/>
-        </w:rPr>
-        <w:t xml:space="preserve"> }}</w:t>
+        <w:t xml:space="preserve"> {{ datadec.restriction_ps_notes }}</w:t>
       </w:r>
     </w:p>
     <w:p>
@@ -2702,56 +1183,14 @@
         <w:rPr>
           <w:rStyle w:val="NumberedListItem"/>
         </w:rPr>
-        <w:t xml:space="preserve">Publications resulting from the Data are {%if </w:t>
-      </w:r>
-      <w:proofErr w:type="spellStart"/>
-      <w:r>
-        <w:rPr>
-          <w:rStyle w:val="NumberedListItem"/>
-        </w:rPr>
-        <w:t>datadec.restriction_pub</w:t>
-      </w:r>
-      <w:proofErr w:type="spellEnd"/>
-      <w:r>
-        <w:rPr>
-          <w:rStyle w:val="NumberedListItem"/>
-        </w:rPr>
-        <w:t xml:space="preserve"> %}</w:t>
-      </w:r>
-      <w:r>
-        <w:rPr>
-          <w:rStyle w:val="NumberedListItem"/>
-        </w:rPr>
-        <w:t xml:space="preserve"> required to adhere to specific publication requirements as further detailed here{{ </w:t>
-      </w:r>
-      <w:proofErr w:type="spellStart"/>
+        <w:t xml:space="preserve">Publications resulting from the Data are {%if datadec.restriction_pub %} required to adhere to specific publication requirements as further detailed here{{ </w:t>
+      </w:r>
       <w:r>
         <w:rPr>
           <w:rStyle w:val="NumberedListItem"/>
         </w:rPr>
         <w:lastRenderedPageBreak/>
-        <w:t>datadec.restriction_pub_notes</w:t>
-      </w:r>
-      <w:proofErr w:type="spellEnd"/>
-      <w:r>
-        <w:rPr>
-          <w:rStyle w:val="NumberedListItem"/>
-        </w:rPr>
-        <w:t xml:space="preserve"> }}{% else %}not required to adhere to specific publication requirements.{% </w:t>
-      </w:r>
-      <w:proofErr w:type="spellStart"/>
-      <w:r>
-        <w:rPr>
-          <w:rStyle w:val="NumberedListItem"/>
-        </w:rPr>
-        <w:t>endif</w:t>
-      </w:r>
-      <w:proofErr w:type="spellEnd"/>
-      <w:r>
-        <w:rPr>
-          <w:rStyle w:val="NumberedListItem"/>
-        </w:rPr>
-        <w:t xml:space="preserve"> %} </w:t>
+        <w:t xml:space="preserve">datadec.restriction_pub_notes }}{% else %}not required to adhere to specific publication requirements.{% endif %} </w:t>
       </w:r>
     </w:p>
     <w:p>
@@ -2769,76 +1208,14 @@
         <w:rPr>
           <w:rStyle w:val="NumberedListItem"/>
         </w:rPr>
-        <w:t xml:space="preserve">Data are {% if </w:t>
-      </w:r>
-      <w:proofErr w:type="spellStart"/>
-      <w:r>
-        <w:rPr>
-          <w:rStyle w:val="NumberedListItem"/>
-        </w:rPr>
-        <w:t>datadec.restrition_rtn</w:t>
-      </w:r>
-      <w:proofErr w:type="spellEnd"/>
-      <w:r>
-        <w:rPr>
-          <w:rStyle w:val="NumberedListItem"/>
-        </w:rPr>
-        <w:t xml:space="preserve"> %} required to adhe</w:t>
-      </w:r>
-      <w:r>
-        <w:rPr>
-          <w:rStyle w:val="NumberedListItem"/>
-        </w:rPr>
-        <w:t>re to specific return requirements as further detailed here: {</w:t>
-      </w:r>
-      <w:proofErr w:type="gramStart"/>
-      <w:r>
-        <w:rPr>
-          <w:rStyle w:val="NumberedListItem"/>
-        </w:rPr>
-        <w:t xml:space="preserve">{ </w:t>
-      </w:r>
-      <w:proofErr w:type="spellStart"/>
-      <w:r>
-        <w:rPr>
-          <w:rStyle w:val="NumberedListItem"/>
-        </w:rPr>
-        <w:t>datadec.restriction</w:t>
-      </w:r>
-      <w:proofErr w:type="gramEnd"/>
-      <w:r>
-        <w:rPr>
-          <w:rStyle w:val="NumberedListItem"/>
-        </w:rPr>
-        <w:t>_rtn_notes</w:t>
-      </w:r>
-      <w:proofErr w:type="spellEnd"/>
-      <w:r>
-        <w:rPr>
-          <w:rStyle w:val="NumberedListItem"/>
-        </w:rPr>
-        <w:t xml:space="preserve"> }}{% else %}not required to adhere to specific return requirements.</w:t>
+        <w:t>Data are {% if datadec.restrition_rtn %} required to adhere to specific return requirements as further detailed here: {{ datadec.restriction_rtn_notes }}{% else %}not required to adhere to specific return requirements.</w:t>
       </w:r>
       <w:r>
         <w:rPr>
           <w:rStyle w:val="NumberedListItem"/>
         </w:rPr>
         <w:br/>
-        <w:t xml:space="preserve">{% </w:t>
-      </w:r>
-      <w:proofErr w:type="spellStart"/>
-      <w:r>
-        <w:rPr>
-          <w:rStyle w:val="NumberedListItem"/>
-        </w:rPr>
-        <w:t>endif</w:t>
-      </w:r>
-      <w:proofErr w:type="spellEnd"/>
-      <w:r>
-        <w:rPr>
-          <w:rStyle w:val="NumberedListItem"/>
-        </w:rPr>
-        <w:t xml:space="preserve"> %} </w:t>
+        <w:t xml:space="preserve">{% endif %} </w:t>
       </w:r>
     </w:p>
     <w:p>
@@ -2853,21 +1230,7 @@
         <w:rPr>
           <w:rStyle w:val="NumberedListItem"/>
         </w:rPr>
-        <w:t xml:space="preserve">{%p if </w:t>
-      </w:r>
-      <w:proofErr w:type="spellStart"/>
-      <w:r>
-        <w:rPr>
-          <w:rStyle w:val="NumberedListItem"/>
-        </w:rPr>
-        <w:t>restriction_other_notes</w:t>
-      </w:r>
-      <w:proofErr w:type="spellEnd"/>
-      <w:r>
-        <w:rPr>
-          <w:rStyle w:val="NumberedListItem"/>
-        </w:rPr>
-        <w:t xml:space="preserve"> %} </w:t>
+        <w:t xml:space="preserve">{%p if restriction_other_notes %} </w:t>
       </w:r>
     </w:p>
     <w:p>
@@ -2885,27 +1248,7 @@
         <w:rPr>
           <w:rStyle w:val="NumberedListItem"/>
         </w:rPr>
-        <w:t>The use of data is subject to the following ot</w:t>
-      </w:r>
-      <w:r>
-        <w:rPr>
-          <w:rStyle w:val="NumberedListItem"/>
-        </w:rPr>
-        <w:t xml:space="preserve">her restrictions: {{ </w:t>
-      </w:r>
-      <w:proofErr w:type="spellStart"/>
-      <w:r>
-        <w:rPr>
-          <w:rStyle w:val="NumberedListItem"/>
-        </w:rPr>
-        <w:t>restriction_other_notes</w:t>
-      </w:r>
-      <w:proofErr w:type="spellEnd"/>
-      <w:r>
-        <w:rPr>
-          <w:rStyle w:val="NumberedListItem"/>
-        </w:rPr>
-        <w:t xml:space="preserve"> }}</w:t>
+        <w:t>The use of data is subject to the following other restrictions: {{ restriction_other_notes }}</w:t>
       </w:r>
     </w:p>
     <w:p>
@@ -2920,21 +1263,7 @@
         <w:rPr>
           <w:rStyle w:val="NumberedListItem"/>
         </w:rPr>
-        <w:t xml:space="preserve">{%p </w:t>
-      </w:r>
-      <w:proofErr w:type="spellStart"/>
-      <w:r>
-        <w:rPr>
-          <w:rStyle w:val="NumberedListItem"/>
-        </w:rPr>
-        <w:t>endif</w:t>
-      </w:r>
-      <w:proofErr w:type="spellEnd"/>
-      <w:r>
-        <w:rPr>
-          <w:rStyle w:val="NumberedListItem"/>
-        </w:rPr>
-        <w:t xml:space="preserve"> %}</w:t>
+        <w:t>{%p endif %}</w:t>
       </w:r>
     </w:p>
     <w:p>
@@ -2942,23 +1271,7 @@
         <w:pStyle w:val="Heading4"/>
       </w:pPr>
       <w:r>
-        <w:t>Data {</w:t>
-      </w:r>
-      <w:proofErr w:type="gramStart"/>
-      <w:r>
-        <w:t xml:space="preserve">{ </w:t>
-      </w:r>
-      <w:proofErr w:type="spellStart"/>
-      <w:r>
-        <w:t>datadec</w:t>
-      </w:r>
-      <w:proofErr w:type="gramEnd"/>
-      <w:r>
-        <w:t>_index</w:t>
-      </w:r>
-      <w:proofErr w:type="spellEnd"/>
-      <w:r>
-        <w:t xml:space="preserve"> }}  - Access Policy</w:t>
+        <w:t>Data {{ datadec_index }}  - Access Policy</w:t>
       </w:r>
     </w:p>
     <w:p>
@@ -2976,41 +1289,7 @@
         <w:rPr>
           <w:rStyle w:val="NumberedListItem"/>
         </w:rPr>
-        <w:t xml:space="preserve">The process for requesting and validating Data Access is described in Annex A of the General Terms of Services. {% if </w:t>
-      </w:r>
-      <w:proofErr w:type="spellStart"/>
-      <w:r>
-        <w:rPr>
-          <w:rStyle w:val="NumberedListItem"/>
-        </w:rPr>
-        <w:t>datadec.access_form_required</w:t>
-      </w:r>
-      <w:proofErr w:type="spellEnd"/>
-      <w:r>
-        <w:rPr>
-          <w:rStyle w:val="NumberedListItem"/>
-        </w:rPr>
-        <w:t xml:space="preserve"> </w:t>
-      </w:r>
-      <w:r>
-        <w:rPr>
-          <w:rStyle w:val="NumberedListItem"/>
-        </w:rPr>
-        <w:t xml:space="preserve">%}Applicants must use the access request template {% </w:t>
-      </w:r>
-      <w:proofErr w:type="spellStart"/>
-      <w:r>
-        <w:rPr>
-          <w:rStyle w:val="NumberedListItem"/>
-        </w:rPr>
-        <w:t>endif</w:t>
-      </w:r>
-      <w:proofErr w:type="spellEnd"/>
-      <w:r>
-        <w:rPr>
-          <w:rStyle w:val="NumberedListItem"/>
-        </w:rPr>
-        <w:t xml:space="preserve"> %}</w:t>
+        <w:t>The process for requesting and validating Data Access is described in Annex A of the General Terms of Services. {% if datadec.access_form_required %}Applicants must use the access request template {% endif %}</w:t>
       </w:r>
     </w:p>
     <w:p>
@@ -3028,55 +1307,7 @@
         <w:rPr>
           <w:rStyle w:val="NumberedListItem"/>
         </w:rPr>
-        <w:t xml:space="preserve">The use of Data is {% if </w:t>
-      </w:r>
-      <w:proofErr w:type="spellStart"/>
-      <w:r>
-        <w:rPr>
-          <w:rStyle w:val="NumberedListItem"/>
-        </w:rPr>
-        <w:t>datadec.restriction_ip</w:t>
-      </w:r>
-      <w:proofErr w:type="spellEnd"/>
-      <w:r>
-        <w:rPr>
-          <w:rStyle w:val="NumberedListItem"/>
-        </w:rPr>
-        <w:t xml:space="preserve"> %} subject to the following IP restrictions/requirements: {{ </w:t>
-      </w:r>
-      <w:proofErr w:type="spellStart"/>
-      <w:r>
-        <w:rPr>
-          <w:rStyle w:val="NumberedListItem"/>
-        </w:rPr>
-        <w:t>datadec.restriction_ip_notes</w:t>
-      </w:r>
-      <w:proofErr w:type="spellEnd"/>
-      <w:r>
-        <w:rPr>
-          <w:rStyle w:val="NumberedListItem"/>
-        </w:rPr>
-        <w:t xml:space="preserve">}} {% else %} not subject to special IP requirements.{% </w:t>
-      </w:r>
-      <w:proofErr w:type="spellStart"/>
-      <w:r>
-        <w:rPr>
-          <w:rStyle w:val="NumberedListItem"/>
-        </w:rPr>
-        <w:t>e</w:t>
-      </w:r>
-      <w:r>
-        <w:rPr>
-          <w:rStyle w:val="NumberedListItem"/>
-        </w:rPr>
-        <w:t>ndif</w:t>
-      </w:r>
-      <w:proofErr w:type="spellEnd"/>
-      <w:r>
-        <w:rPr>
-          <w:rStyle w:val="NumberedListItem"/>
-        </w:rPr>
-        <w:t xml:space="preserve"> %}</w:t>
+        <w:t>The use of Data is {% if datadec.restriction_ip %} subject to the following IP restrictions/requirements: {{ datadec.restriction_ip_notes}} {% else %} not subject to special IP requirements.{% endif %}</w:t>
       </w:r>
     </w:p>
     <w:p>
@@ -3084,51 +1315,31 @@
         <w:rPr>
           <w:rFonts w:cstheme="minorHAnsi"/>
         </w:rPr>
-        <w:t xml:space="preserve">{% </w:t>
-      </w:r>
-      <w:proofErr w:type="spellStart"/>
-      <w:r>
+        <w:t>{% endfor %}</w:t>
+      </w:r>
+    </w:p>
+    <w:p>
+      <w:pPr>
         <w:rPr>
           <w:rFonts w:cstheme="minorHAnsi"/>
         </w:rPr>
-        <w:t>endfor</w:t>
-      </w:r>
-      <w:proofErr w:type="spellEnd"/>
-      <w:r>
+      </w:pPr>
+    </w:p>
+    <w:p>
+      <w:pPr>
         <w:rPr>
           <w:rFonts w:cstheme="minorHAnsi"/>
         </w:rPr>
-        <w:t xml:space="preserve"> %}</w:t>
-      </w:r>
-    </w:p>
-    <w:p>
-      <w:pPr>
-        <w:rPr>
-          <w:rFonts w:cstheme="minorHAnsi"/>
-        </w:rPr>
-      </w:pPr>
-    </w:p>
-    <w:p>
-      <w:pPr>
-        <w:rPr>
-          <w:rFonts w:cstheme="minorHAnsi"/>
-        </w:rPr>
-      </w:pPr>
-    </w:p>
-    <w:p>
-      <w:r>
-        <w:t>The Main Contact confirms that the information provided for this submission is complete and correct. The Main Contact is responsible for any subsequent incorrect use of the Data or violation to the Data Subjects’ rights by UL/LCSB th</w:t>
-      </w:r>
-      <w:r>
-        <w:t xml:space="preserve">at stem from incorrect or incomplete information. </w:t>
-      </w:r>
-    </w:p>
-    <w:p>
-      <w:r>
-        <w:t>The Main Contact confirms that the Data Provider remains responsible for managing and/or coordinating the exercise of Data Subjects’ rights and for any necessary information provision. UL/LCSB will support</w:t>
-      </w:r>
-      <w:r>
-        <w:t xml:space="preserve"> the Main Contact in fulfilling this responsibility but will not have any direct contact with the Data Subjects.</w:t>
+      </w:pPr>
+    </w:p>
+    <w:p>
+      <w:r>
+        <w:t xml:space="preserve">The Main Contact confirms that the information provided for this submission is complete and correct. The Main Contact is responsible for any subsequent incorrect use of the Data or violation to the Data Subjects’ rights by UL/LCSB that stem from incorrect or incomplete information. </w:t>
+      </w:r>
+    </w:p>
+    <w:p>
+      <w:r>
+        <w:t>The Main Contact confirms that the Data Provider remains responsible for managing and/or coordinating the exercise of Data Subjects’ rights and for any necessary information provision. UL/LCSB will support the Main Contact in fulfilling this responsibility but will not have any direct contact with the Data Subjects.</w:t>
       </w:r>
     </w:p>
     <w:p/>
@@ -3155,7 +1366,6 @@
     <w:sectPr>
       <w:pgSz w:w="12240" w:h="15840"/>
       <w:pgMar w:top="1440" w:right="1440" w:bottom="1440" w:left="1440" w:header="0" w:footer="0" w:gutter="0"/>
-      <w:lnNumType w:countBy="5" w:distance="283" w:restart="continuous"/>
       <w:cols w:space="720"/>
       <w:formProt w:val="0"/>
       <w:docGrid w:linePitch="360"/>
@@ -3165,7 +1375,7 @@
 </file>
 
 <file path=word/numbering.xml><?xml version="1.0" encoding="utf-8"?>
-<w:numbering xmlns:wpc="http://schemas.microsoft.com/office/word/2010/wordprocessingCanvas" xmlns:cx="http://schemas.microsoft.com/office/drawing/2014/chartex" xmlns:cx1="http://schemas.microsoft.com/office/drawing/2015/9/8/chartex" xmlns:mc="http://schemas.openxmlformats.org/markup-compatibility/2006" xmlns:o="urn:schemas-microsoft-com:office:office" xmlns:r="http://schemas.openxmlformats.org/officeDocument/2006/relationships" xmlns:m="http://schemas.openxmlformats.org/officeDocument/2006/math" xmlns:v="urn:schemas-microsoft-com:vml" xmlns:wp14="http://schemas.microsoft.com/office/word/2010/wordprocessingDrawing" xmlns:wp="http://schemas.openxmlformats.org/drawingml/2006/wordprocessingDrawing" xmlns:w10="urn:schemas-microsoft-com:office:word" xmlns:w="http://schemas.openxmlformats.org/wordprocessingml/2006/main" xmlns:w14="http://schemas.microsoft.com/office/word/2010/wordml" xmlns:w15="http://schemas.microsoft.com/office/word/2012/wordml" xmlns:w16se="http://schemas.microsoft.com/office/word/2015/wordml/symex" xmlns:wpg="http://schemas.microsoft.com/office/word/2010/wordprocessingGroup" xmlns:wpi="http://schemas.microsoft.com/office/word/2010/wordprocessingInk" xmlns:wne="http://schemas.microsoft.com/office/word/2006/wordml" xmlns:wps="http://schemas.microsoft.com/office/word/2010/wordprocessingShape" mc:Ignorable="w14 w15 w16se wp14">
+<w:numbering xmlns:wpc="http://schemas.microsoft.com/office/word/2010/wordprocessingCanvas" xmlns:cx="http://schemas.microsoft.com/office/drawing/2014/chartex" xmlns:cx1="http://schemas.microsoft.com/office/drawing/2015/9/8/chartex" xmlns:cx2="http://schemas.microsoft.com/office/drawing/2015/10/21/chartex" xmlns:cx3="http://schemas.microsoft.com/office/drawing/2016/5/9/chartex" xmlns:cx4="http://schemas.microsoft.com/office/drawing/2016/5/10/chartex" xmlns:cx5="http://schemas.microsoft.com/office/drawing/2016/5/11/chartex" xmlns:cx6="http://schemas.microsoft.com/office/drawing/2016/5/12/chartex" xmlns:cx7="http://schemas.microsoft.com/office/drawing/2016/5/13/chartex" xmlns:cx8="http://schemas.microsoft.com/office/drawing/2016/5/14/chartex" xmlns:mc="http://schemas.openxmlformats.org/markup-compatibility/2006" xmlns:aink="http://schemas.microsoft.com/office/drawing/2016/ink" xmlns:am3d="http://schemas.microsoft.com/office/drawing/2017/model3d" xmlns:o="urn:schemas-microsoft-com:office:office" xmlns:r="http://schemas.openxmlformats.org/officeDocument/2006/relationships" xmlns:m="http://schemas.openxmlformats.org/officeDocument/2006/math" xmlns:v="urn:schemas-microsoft-com:vml" xmlns:wp14="http://schemas.microsoft.com/office/word/2010/wordprocessingDrawing" xmlns:wp="http://schemas.openxmlformats.org/drawingml/2006/wordprocessingDrawing" xmlns:w10="urn:schemas-microsoft-com:office:word" xmlns:w="http://schemas.openxmlformats.org/wordprocessingml/2006/main" xmlns:w14="http://schemas.microsoft.com/office/word/2010/wordml" xmlns:w15="http://schemas.microsoft.com/office/word/2012/wordml" xmlns:w16cex="http://schemas.microsoft.com/office/word/2018/wordml/cex" xmlns:w16cid="http://schemas.microsoft.com/office/word/2016/wordml/cid" xmlns:w16="http://schemas.microsoft.com/office/word/2018/wordml" xmlns:w16se="http://schemas.microsoft.com/office/word/2015/wordml/symex" xmlns:wpg="http://schemas.microsoft.com/office/word/2010/wordprocessingGroup" xmlns:wpi="http://schemas.microsoft.com/office/word/2010/wordprocessingInk" xmlns:wne="http://schemas.microsoft.com/office/word/2006/wordml" xmlns:wps="http://schemas.microsoft.com/office/word/2010/wordprocessingShape" mc:Ignorable="w14 w15 w16se w16cid w16 w16cex wp14">
   <w:abstractNum w:abstractNumId="0" w15:restartNumberingAfterBreak="0">
     <w:nsid w:val="365B782D"/>
     <w:multiLevelType w:val="multilevel"/>
@@ -3784,7 +1994,7 @@
 </file>
 
 <file path=word/styles.xml><?xml version="1.0" encoding="utf-8"?>
-<w:styles xmlns:mc="http://schemas.openxmlformats.org/markup-compatibility/2006" xmlns:r="http://schemas.openxmlformats.org/officeDocument/2006/relationships" xmlns:w="http://schemas.openxmlformats.org/wordprocessingml/2006/main" xmlns:w14="http://schemas.microsoft.com/office/word/2010/wordml" xmlns:w15="http://schemas.microsoft.com/office/word/2012/wordml" xmlns:w16se="http://schemas.microsoft.com/office/word/2015/wordml/symex" mc:Ignorable="w14 w15 w16se">
+<w:styles xmlns:mc="http://schemas.openxmlformats.org/markup-compatibility/2006" xmlns:r="http://schemas.openxmlformats.org/officeDocument/2006/relationships" xmlns:w="http://schemas.openxmlformats.org/wordprocessingml/2006/main" xmlns:w14="http://schemas.microsoft.com/office/word/2010/wordml" xmlns:w15="http://schemas.microsoft.com/office/word/2012/wordml" xmlns:w16cex="http://schemas.microsoft.com/office/word/2018/wordml/cex" xmlns:w16cid="http://schemas.microsoft.com/office/word/2016/wordml/cid" xmlns:w16="http://schemas.microsoft.com/office/word/2018/wordml" xmlns:w16se="http://schemas.microsoft.com/office/word/2015/wordml/symex" mc:Ignorable="w14 w15 w16se w16cid w16 w16cex">
   <w:docDefaults>
     <w:rPrDefault>
       <w:rPr>
@@ -3795,7 +2005,7 @@
     </w:rPrDefault>
     <w:pPrDefault/>
   </w:docDefaults>
-  <w:latentStyles w:defLockedState="0" w:defUIPriority="99" w:defSemiHidden="0" w:defUnhideWhenUsed="0" w:defQFormat="0" w:count="371">
+  <w:latentStyles w:defLockedState="0" w:defUIPriority="99" w:defSemiHidden="0" w:defUnhideWhenUsed="0" w:defQFormat="0" w:count="376">
     <w:lsdException w:name="Normal" w:uiPriority="0" w:qFormat="1"/>
     <w:lsdException w:name="heading 1" w:uiPriority="9" w:qFormat="1"/>
     <w:lsdException w:name="heading 2" w:semiHidden="1" w:uiPriority="9" w:unhideWhenUsed="1" w:qFormat="1"/>
@@ -3901,7 +2111,6 @@
     <w:lsdException w:name="HTML Sample" w:semiHidden="1" w:unhideWhenUsed="1"/>
     <w:lsdException w:name="HTML Typewriter" w:semiHidden="1" w:unhideWhenUsed="1"/>
     <w:lsdException w:name="HTML Variable" w:semiHidden="1" w:unhideWhenUsed="1"/>
-    <w:lsdException w:name="Normal Table" w:semiHidden="1" w:unhideWhenUsed="1"/>
     <w:lsdException w:name="annotation subject" w:semiHidden="1" w:unhideWhenUsed="1"/>
     <w:lsdException w:name="No List" w:semiHidden="1" w:unhideWhenUsed="1"/>
     <w:lsdException w:name="Outline List 1" w:semiHidden="1" w:unhideWhenUsed="1"/>
@@ -3944,11 +2153,8 @@
     <w:lsdException w:name="Table Contemporary" w:semiHidden="1" w:unhideWhenUsed="1"/>
     <w:lsdException w:name="Table Elegant" w:semiHidden="1" w:unhideWhenUsed="1"/>
     <w:lsdException w:name="Table Professional" w:semiHidden="1" w:unhideWhenUsed="1"/>
-    <w:lsdException w:name="Table Subtle 1" w:semiHidden="1" w:unhideWhenUsed="1"/>
     <w:lsdException w:name="Table Subtle 2" w:semiHidden="1" w:unhideWhenUsed="1"/>
     <w:lsdException w:name="Table Web 1" w:semiHidden="1" w:unhideWhenUsed="1"/>
-    <w:lsdException w:name="Table Web 2" w:semiHidden="1" w:unhideWhenUsed="1"/>
-    <w:lsdException w:name="Table Web 3" w:semiHidden="1" w:unhideWhenUsed="1"/>
     <w:lsdException w:name="Balloon Text" w:semiHidden="1" w:unhideWhenUsed="1"/>
     <w:lsdException w:name="Table Grid" w:uiPriority="39"/>
     <w:lsdException w:name="Table Theme" w:semiHidden="1" w:unhideWhenUsed="1"/>
@@ -4167,6 +2373,11 @@
     <w:lsdException w:name="List Table 5 Dark Accent 6" w:uiPriority="50"/>
     <w:lsdException w:name="List Table 6 Colorful Accent 6" w:uiPriority="51"/>
     <w:lsdException w:name="List Table 7 Colorful Accent 6" w:uiPriority="52"/>
+    <w:lsdException w:name="Mention" w:semiHidden="1" w:unhideWhenUsed="1"/>
+    <w:lsdException w:name="Smart Hyperlink" w:semiHidden="1" w:unhideWhenUsed="1"/>
+    <w:lsdException w:name="Hashtag" w:semiHidden="1" w:unhideWhenUsed="1"/>
+    <w:lsdException w:name="Unresolved Mention" w:semiHidden="1" w:unhideWhenUsed="1"/>
+    <w:lsdException w:name="Smart Link" w:semiHidden="1" w:unhideWhenUsed="1"/>
   </w:latentStyles>
   <w:style w:type="paragraph" w:default="1" w:styleId="Normal">
     <w:name w:val="Normal"/>

</xml_diff>